<commit_message>
weather: fetch from NASA POWER daily API, replacing the retired eosweb SSE endpoint
The NASA branch of weather() now calls the NASA POWER daily single-point API by longitude/latitude and returns FAO-56-ready columns: Tmax/Tmin/Tmean (C), RH (percent), uz (m/s), Rs (MJ/m2/day), P (mm/day), altitude, plus a calendar 'date' and numeric DOY. ALLSKY_SFC_SW_DWN is already MJ/m2/day so no conversion is applied. Also guards a length-condition in the date check. weather.Rd and the manual weather section document the POWER workflow and manual-download links (POWER Data Access Viewer, Open-Meteo, ERA5/CDS, NOAA). Verified end-to-end weather -> ETo on the installed package.
</commit_message>
<xml_diff>
--- a/manual/sebkc_manual.docx
+++ b/manual/sebkc_manual.docx
@@ -827,7 +827,7 @@
     </w:p>
     <w:bookmarkEnd w:id="20"/>
     <w:bookmarkEnd w:id="21"/>
-    <w:bookmarkStart w:id="34" w:name="part-1-et-from-weather-data-point"/>
+    <w:bookmarkStart w:id="40" w:name="part-1-et-from-weather-data-point"/>
     <w:p>
       <w:pPr>
         <w:pStyle w:val="Heading1"/>
@@ -3902,7 +3902,7 @@
       </w:r>
     </w:p>
     <w:bookmarkEnd w:id="26"/>
-    <w:bookmarkStart w:id="27" w:name="weather-retrieving-weather-data"/>
+    <w:bookmarkStart w:id="33" w:name="weather-retrieving-weather-data"/>
     <w:p>
       <w:pPr>
         <w:pStyle w:val="Heading2"/>
@@ -3937,13 +3937,7 @@
         <w:t xml:space="preserve"> </w:t>
       </w:r>
       <w:r>
-        <w:t xml:space="preserve">fetches station data by WMO code or airport (IATA/ICAO) code, and NASA</w:t>
-      </w:r>
-      <w:r>
-        <w:t xml:space="preserve"> </w:t>
-      </w:r>
-      <w:r>
-        <w:t xml:space="preserve">SSE solar data by coordinates, so you can build the</w:t>
+        <w:t xml:space="preserve">builds the</w:t>
       </w:r>
       <w:r>
         <w:t xml:space="preserve"> </w:t>
@@ -3955,16 +3949,53 @@
         <w:t xml:space="preserve">ETo</w:t>
       </w:r>
       <w:r>
-        <w:t xml:space="preserve"> </w:t>
-      </w:r>
-      <w:r>
-        <w:t xml:space="preserve">inputs without a local</w:t>
-      </w:r>
-      <w:r>
-        <w:t xml:space="preserve"> </w:t>
-      </w:r>
-      <w:r>
-        <w:t xml:space="preserve">station (internet required):</w:t>
+        <w:t xml:space="preserve">/</w:t>
+      </w:r>
+      <w:r>
+        <w:rPr>
+          <w:rStyle w:val="VerbatimChar"/>
+        </w:rPr>
+        <w:t xml:space="preserve">kc</w:t>
+      </w:r>
+      <w:r>
+        <w:t xml:space="preserve"> </w:t>
+      </w:r>
+      <w:r>
+        <w:t xml:space="preserve">inputs for a site from the</w:t>
+      </w:r>
+      <w:r>
+        <w:t xml:space="preserve"> </w:t>
+      </w:r>
+      <w:r>
+        <w:rPr>
+          <w:bCs/>
+          <w:b/>
+        </w:rPr>
+        <w:t xml:space="preserve">NASA POWER</w:t>
+      </w:r>
+      <w:r>
+        <w:t xml:space="preserve"> </w:t>
+      </w:r>
+      <w:r>
+        <w:t xml:space="preserve">daily</w:t>
+      </w:r>
+      <w:r>
+        <w:t xml:space="preserve"> </w:t>
+      </w:r>
+      <w:r>
+        <w:t xml:space="preserve">data service (an internet connection is required). Give it a longitude/latitude and</w:t>
+      </w:r>
+      <w:r>
+        <w:t xml:space="preserve"> </w:t>
+      </w:r>
+      <w:r>
+        <w:t xml:space="preserve">a date range; it returns temperature, humidity, wind, solar radiation and</w:t>
+      </w:r>
+      <w:r>
+        <w:t xml:space="preserve"> </w:t>
+      </w:r>
+      <w:r>
+        <w:t xml:space="preserve">precipitation, already named and unit-ready for FAO-56:</w:t>
       </w:r>
     </w:p>
     <w:p>
@@ -3973,218 +4004,704 @@
       </w:pPr>
       <w:r>
         <w:rPr>
+          <w:rStyle w:val="NormalTok"/>
+        </w:rPr>
+        <w:t xml:space="preserve">kumasi </w:t>
+      </w:r>
+      <w:r>
+        <w:rPr>
+          <w:rStyle w:val="OtherTok"/>
+        </w:rPr>
+        <w:t xml:space="preserve">&lt;-</w:t>
+      </w:r>
+      <w:r>
+        <w:rPr>
+          <w:rStyle w:val="NormalTok"/>
+        </w:rPr>
+        <w:t xml:space="preserve"> </w:t>
+      </w:r>
+      <w:r>
+        <w:rPr>
+          <w:rStyle w:val="FunctionTok"/>
+        </w:rPr>
+        <w:t xml:space="preserve">weather</w:t>
+      </w:r>
+      <w:r>
+        <w:rPr>
+          <w:rStyle w:val="NormalTok"/>
+        </w:rPr>
+        <w:t xml:space="preserve">(</w:t>
+      </w:r>
+      <w:r>
+        <w:rPr>
+          <w:rStyle w:val="AttributeTok"/>
+        </w:rPr>
+        <w:t xml:space="preserve">longitude =</w:t>
+      </w:r>
+      <w:r>
+        <w:rPr>
+          <w:rStyle w:val="NormalTok"/>
+        </w:rPr>
+        <w:t xml:space="preserve"> </w:t>
+      </w:r>
+      <w:r>
+        <w:rPr>
+          <w:rStyle w:val="SpecialCharTok"/>
+        </w:rPr>
+        <w:t xml:space="preserve">-</w:t>
+      </w:r>
+      <w:r>
+        <w:rPr>
+          <w:rStyle w:val="FloatTok"/>
+        </w:rPr>
+        <w:t xml:space="preserve">1.5</w:t>
+      </w:r>
+      <w:r>
+        <w:rPr>
+          <w:rStyle w:val="NormalTok"/>
+        </w:rPr>
+        <w:t xml:space="preserve">, </w:t>
+      </w:r>
+      <w:r>
+        <w:rPr>
+          <w:rStyle w:val="AttributeTok"/>
+        </w:rPr>
+        <w:t xml:space="preserve">latitude =</w:t>
+      </w:r>
+      <w:r>
+        <w:rPr>
+          <w:rStyle w:val="NormalTok"/>
+        </w:rPr>
+        <w:t xml:space="preserve"> </w:t>
+      </w:r>
+      <w:r>
+        <w:rPr>
+          <w:rStyle w:val="FloatTok"/>
+        </w:rPr>
+        <w:t xml:space="preserve">6.7</w:t>
+      </w:r>
+      <w:r>
+        <w:rPr>
+          <w:rStyle w:val="NormalTok"/>
+        </w:rPr>
+        <w:t xml:space="preserve">,</w:t>
+      </w:r>
+      <w:r>
+        <w:br/>
+      </w:r>
+      <w:r>
+        <w:rPr>
+          <w:rStyle w:val="NormalTok"/>
+        </w:rPr>
+        <w:t xml:space="preserve">                  </w:t>
+      </w:r>
+      <w:r>
+        <w:rPr>
+          <w:rStyle w:val="AttributeTok"/>
+        </w:rPr>
+        <w:t xml:space="preserve">NASA.SSE =</w:t>
+      </w:r>
+      <w:r>
+        <w:rPr>
+          <w:rStyle w:val="NormalTok"/>
+        </w:rPr>
+        <w:t xml:space="preserve"> </w:t>
+      </w:r>
+      <w:r>
+        <w:rPr>
+          <w:rStyle w:val="FunctionTok"/>
+        </w:rPr>
+        <w:t xml:space="preserve">list</w:t>
+      </w:r>
+      <w:r>
+        <w:rPr>
+          <w:rStyle w:val="NormalTok"/>
+        </w:rPr>
+        <w:t xml:space="preserve">(</w:t>
+      </w:r>
+      <w:r>
+        <w:rPr>
+          <w:rStyle w:val="AttributeTok"/>
+        </w:rPr>
+        <w:t xml:space="preserve">from =</w:t>
+      </w:r>
+      <w:r>
+        <w:rPr>
+          <w:rStyle w:val="NormalTok"/>
+        </w:rPr>
+        <w:t xml:space="preserve"> </w:t>
+      </w:r>
+      <w:r>
+        <w:rPr>
+          <w:rStyle w:val="StringTok"/>
+        </w:rPr>
+        <w:t xml:space="preserve">"2001-04-01"</w:t>
+      </w:r>
+      <w:r>
+        <w:rPr>
+          <w:rStyle w:val="NormalTok"/>
+        </w:rPr>
+        <w:t xml:space="preserve">, </w:t>
+      </w:r>
+      <w:r>
+        <w:rPr>
+          <w:rStyle w:val="AttributeTok"/>
+        </w:rPr>
+        <w:t xml:space="preserve">to =</w:t>
+      </w:r>
+      <w:r>
+        <w:rPr>
+          <w:rStyle w:val="NormalTok"/>
+        </w:rPr>
+        <w:t xml:space="preserve"> </w:t>
+      </w:r>
+      <w:r>
+        <w:rPr>
+          <w:rStyle w:val="StringTok"/>
+        </w:rPr>
+        <w:t xml:space="preserve">"2001-04-07"</w:t>
+      </w:r>
+      <w:r>
+        <w:rPr>
+          <w:rStyle w:val="NormalTok"/>
+        </w:rPr>
+        <w:t xml:space="preserve">))</w:t>
+      </w:r>
+      <w:r>
+        <w:br/>
+      </w:r>
+      <w:r>
+        <w:rPr>
+          <w:rStyle w:val="NormalTok"/>
+        </w:rPr>
+        <w:t xml:space="preserve">d </w:t>
+      </w:r>
+      <w:r>
+        <w:rPr>
+          <w:rStyle w:val="OtherTok"/>
+        </w:rPr>
+        <w:t xml:space="preserve">&lt;-</w:t>
+      </w:r>
+      <w:r>
+        <w:rPr>
+          <w:rStyle w:val="NormalTok"/>
+        </w:rPr>
+        <w:t xml:space="preserve"> kumasi</w:t>
+      </w:r>
+      <w:r>
+        <w:rPr>
+          <w:rStyle w:val="SpecialCharTok"/>
+        </w:rPr>
+        <w:t xml:space="preserve">$</w:t>
+      </w:r>
+      <w:r>
+        <w:rPr>
+          <w:rStyle w:val="NormalTok"/>
+        </w:rPr>
+        <w:t xml:space="preserve">NASA.SEE</w:t>
+      </w:r>
+      <w:r>
+        <w:rPr>
+          <w:rStyle w:val="SpecialCharTok"/>
+        </w:rPr>
+        <w:t xml:space="preserve">$</w:t>
+      </w:r>
+      <w:r>
+        <w:rPr>
+          <w:rStyle w:val="NormalTok"/>
+        </w:rPr>
+        <w:t xml:space="preserve">data</w:t>
+      </w:r>
+      <w:r>
+        <w:br/>
+      </w:r>
+      <w:r>
+        <w:rPr>
+          <w:rStyle w:val="NormalTok"/>
+        </w:rPr>
+        <w:t xml:space="preserve">d[, </w:t>
+      </w:r>
+      <w:r>
+        <w:rPr>
+          <w:rStyle w:val="FunctionTok"/>
+        </w:rPr>
+        <w:t xml:space="preserve">c</w:t>
+      </w:r>
+      <w:r>
+        <w:rPr>
+          <w:rStyle w:val="NormalTok"/>
+        </w:rPr>
+        <w:t xml:space="preserve">(</w:t>
+      </w:r>
+      <w:r>
+        <w:rPr>
+          <w:rStyle w:val="StringTok"/>
+        </w:rPr>
+        <w:t xml:space="preserve">"date"</w:t>
+      </w:r>
+      <w:r>
+        <w:rPr>
+          <w:rStyle w:val="NormalTok"/>
+        </w:rPr>
+        <w:t xml:space="preserve">,</w:t>
+      </w:r>
+      <w:r>
+        <w:rPr>
+          <w:rStyle w:val="StringTok"/>
+        </w:rPr>
+        <w:t xml:space="preserve">"Tmax"</w:t>
+      </w:r>
+      <w:r>
+        <w:rPr>
+          <w:rStyle w:val="NormalTok"/>
+        </w:rPr>
+        <w:t xml:space="preserve">,</w:t>
+      </w:r>
+      <w:r>
+        <w:rPr>
+          <w:rStyle w:val="StringTok"/>
+        </w:rPr>
+        <w:t xml:space="preserve">"Tmin"</w:t>
+      </w:r>
+      <w:r>
+        <w:rPr>
+          <w:rStyle w:val="NormalTok"/>
+        </w:rPr>
+        <w:t xml:space="preserve">,</w:t>
+      </w:r>
+      <w:r>
+        <w:rPr>
+          <w:rStyle w:val="StringTok"/>
+        </w:rPr>
+        <w:t xml:space="preserve">"RH"</w:t>
+      </w:r>
+      <w:r>
+        <w:rPr>
+          <w:rStyle w:val="NormalTok"/>
+        </w:rPr>
+        <w:t xml:space="preserve">,</w:t>
+      </w:r>
+      <w:r>
+        <w:rPr>
+          <w:rStyle w:val="StringTok"/>
+        </w:rPr>
+        <w:t xml:space="preserve">"uz"</w:t>
+      </w:r>
+      <w:r>
+        <w:rPr>
+          <w:rStyle w:val="NormalTok"/>
+        </w:rPr>
+        <w:t xml:space="preserve">,</w:t>
+      </w:r>
+      <w:r>
+        <w:rPr>
+          <w:rStyle w:val="StringTok"/>
+        </w:rPr>
+        <w:t xml:space="preserve">"Rs"</w:t>
+      </w:r>
+      <w:r>
+        <w:rPr>
+          <w:rStyle w:val="NormalTok"/>
+        </w:rPr>
+        <w:t xml:space="preserve">,</w:t>
+      </w:r>
+      <w:r>
+        <w:rPr>
+          <w:rStyle w:val="StringTok"/>
+        </w:rPr>
+        <w:t xml:space="preserve">"P"</w:t>
+      </w:r>
+      <w:r>
+        <w:rPr>
+          <w:rStyle w:val="NormalTok"/>
+        </w:rPr>
+        <w:t xml:space="preserve">)]</w:t>
+      </w:r>
+      <w:r>
+        <w:br/>
+      </w:r>
+      <w:r>
+        <w:rPr>
           <w:rStyle w:val="CommentTok"/>
         </w:rPr>
-        <w:t xml:space="preserve"># NASA SSE solar/meteorology for Kumasi, Ghana</w:t>
+        <w:t xml:space="preserve">#&gt;         date  Tmax  Tmin    RH   uz    Rs    P</w:t>
       </w:r>
       <w:r>
         <w:br/>
       </w:r>
       <w:r>
         <w:rPr>
-          <w:rStyle w:val="NormalTok"/>
-        </w:rPr>
-        <w:t xml:space="preserve">kumasi </w:t>
-      </w:r>
-      <w:r>
-        <w:rPr>
-          <w:rStyle w:val="OtherTok"/>
-        </w:rPr>
-        <w:t xml:space="preserve">&lt;-</w:t>
-      </w:r>
-      <w:r>
-        <w:rPr>
-          <w:rStyle w:val="NormalTok"/>
-        </w:rPr>
-        <w:t xml:space="preserve"> </w:t>
-      </w:r>
-      <w:r>
-        <w:rPr>
-          <w:rStyle w:val="FunctionTok"/>
-        </w:rPr>
-        <w:t xml:space="preserve">weather</w:t>
-      </w:r>
-      <w:r>
-        <w:rPr>
-          <w:rStyle w:val="NormalTok"/>
-        </w:rPr>
-        <w:t xml:space="preserve">(</w:t>
-      </w:r>
-      <w:r>
-        <w:rPr>
-          <w:rStyle w:val="AttributeTok"/>
-        </w:rPr>
-        <w:t xml:space="preserve">longitude =</w:t>
-      </w:r>
-      <w:r>
-        <w:rPr>
-          <w:rStyle w:val="NormalTok"/>
-        </w:rPr>
-        <w:t xml:space="preserve"> </w:t>
-      </w:r>
-      <w:r>
-        <w:rPr>
-          <w:rStyle w:val="SpecialCharTok"/>
-        </w:rPr>
+          <w:rStyle w:val="CommentTok"/>
+        </w:rPr>
+        <w:t xml:space="preserve">#&gt; 1 2001-04-01 34.01 23.84 74.99 2.50 22.41 6.73</w:t>
+      </w:r>
+      <w:r>
+        <w:br/>
+      </w:r>
+      <w:r>
+        <w:rPr>
+          <w:rStyle w:val="CommentTok"/>
+        </w:rPr>
+        <w:t xml:space="preserve">#&gt; 2 2001-04-02 33.33 23.39 77.89 2.91 22.63 5.28</w:t>
+      </w:r>
+      <w:r>
+        <w:br/>
+      </w:r>
+      <w:r>
+        <w:rPr>
+          <w:rStyle w:val="CommentTok"/>
+        </w:rPr>
+        <w:t xml:space="preserve">#&gt; 3 2001-04-03 30.30 23.47 81.28 3.01 10.49 4.27</w:t>
+      </w:r>
+      <w:r>
+        <w:br/>
+      </w:r>
+      <w:r>
+        <w:rPr>
+          <w:rStyle w:val="CommentTok"/>
+        </w:rPr>
+        <w:t xml:space="preserve">#&gt; ... (7 days)</w:t>
+      </w:r>
+    </w:p>
+    <w:p>
+      <w:pPr>
+        <w:pStyle w:val="FirstParagraph"/>
+      </w:pPr>
+      <w:r>
+        <w:t xml:space="preserve">The columns carry FAO-56 names and units:</w:t>
+      </w:r>
+      <w:r>
+        <w:t xml:space="preserve"> </w:t>
+      </w:r>
+      <w:r>
+        <w:rPr>
+          <w:rStyle w:val="VerbatimChar"/>
+        </w:rPr>
+        <w:t xml:space="preserve">Tmax</w:t>
+      </w:r>
+      <w:r>
+        <w:t xml:space="preserve">/</w:t>
+      </w:r>
+      <w:r>
+        <w:rPr>
+          <w:rStyle w:val="VerbatimChar"/>
+        </w:rPr>
+        <w:t xml:space="preserve">Tmin</w:t>
+      </w:r>
+      <w:r>
+        <w:t xml:space="preserve">/</w:t>
+      </w:r>
+      <w:r>
+        <w:rPr>
+          <w:rStyle w:val="VerbatimChar"/>
+        </w:rPr>
+        <w:t xml:space="preserve">Tmean</w:t>
+      </w:r>
+      <w:r>
+        <w:t xml:space="preserve"> </w:t>
+      </w:r>
+      <w:r>
+        <w:t xml:space="preserve">(°C),</w:t>
+      </w:r>
+      <w:r>
+        <w:t xml:space="preserve"> </w:t>
+      </w:r>
+      <w:r>
+        <w:rPr>
+          <w:rStyle w:val="VerbatimChar"/>
+        </w:rPr>
+        <w:t xml:space="preserve">RH</w:t>
+      </w:r>
+      <w:r>
+        <w:t xml:space="preserve"> </w:t>
+      </w:r>
+      <w:r>
+        <w:t xml:space="preserve">(%),</w:t>
+      </w:r>
+      <w:r>
+        <w:t xml:space="preserve"> </w:t>
+      </w:r>
+      <w:r>
+        <w:rPr>
+          <w:rStyle w:val="VerbatimChar"/>
+        </w:rPr>
+        <w:t xml:space="preserve">uz</w:t>
+      </w:r>
+      <w:r>
+        <w:t xml:space="preserve"> </w:t>
+      </w:r>
+      <w:r>
+        <w:t xml:space="preserve">(2-m wind, m/s),</w:t>
+      </w:r>
+      <w:r>
+        <w:t xml:space="preserve"> </w:t>
+      </w:r>
+      <w:r>
+        <w:rPr>
+          <w:rStyle w:val="VerbatimChar"/>
+        </w:rPr>
+        <w:t xml:space="preserve">Rs</w:t>
+      </w:r>
+      <w:r>
+        <w:t xml:space="preserve"> </w:t>
+      </w:r>
+      <w:r>
+        <w:t xml:space="preserve">(solar radiation,</w:t>
+      </w:r>
+      <w:r>
+        <w:t xml:space="preserve"> </w:t>
+      </w:r>
+      <w:r>
+        <w:rPr>
+          <w:bCs/>
+          <w:b/>
+        </w:rPr>
+        <w:t xml:space="preserve">MJ/m²/day</w:t>
+      </w:r>
+      <w:r>
+        <w:t xml:space="preserve">),</w:t>
+      </w:r>
+      <w:r>
+        <w:t xml:space="preserve"> </w:t>
+      </w:r>
+      <w:r>
+        <w:rPr>
+          <w:rStyle w:val="VerbatimChar"/>
+        </w:rPr>
+        <w:t xml:space="preserve">P</w:t>
+      </w:r>
+      <w:r>
+        <w:t xml:space="preserve"> </w:t>
+      </w:r>
+      <w:r>
+        <w:t xml:space="preserve">(mm/day) and</w:t>
+      </w:r>
+      <w:r>
+        <w:t xml:space="preserve"> </w:t>
+      </w:r>
+      <w:r>
+        <w:rPr>
+          <w:rStyle w:val="VerbatimChar"/>
+        </w:rPr>
+        <w:t xml:space="preserve">altitude</w:t>
+      </w:r>
+      <w:r>
+        <w:t xml:space="preserve"> </w:t>
+      </w:r>
+      <w:r>
+        <w:t xml:space="preserve">(m, from the POWER header), plus a calendar</w:t>
+      </w:r>
+      <w:r>
+        <w:t xml:space="preserve"> </w:t>
+      </w:r>
+      <w:r>
+        <w:rPr>
+          <w:rStyle w:val="VerbatimChar"/>
+        </w:rPr>
+        <w:t xml:space="preserve">date</w:t>
+      </w:r>
+      <w:r>
+        <w:t xml:space="preserve"> </w:t>
+      </w:r>
+      <w:r>
+        <w:t xml:space="preserve">and a numeric</w:t>
+      </w:r>
+      <w:r>
+        <w:t xml:space="preserve"> </w:t>
+      </w:r>
+      <w:r>
+        <w:rPr>
+          <w:rStyle w:val="VerbatimChar"/>
+        </w:rPr>
+        <w:t xml:space="preserve">DOY</w:t>
+      </w:r>
+      <w:r>
+        <w:t xml:space="preserve">. They feed</w:t>
+      </w:r>
+      <w:r>
+        <w:t xml:space="preserve"> </w:t>
+      </w:r>
+      <w:r>
+        <w:rPr>
+          <w:rStyle w:val="VerbatimChar"/>
+        </w:rPr>
+        <w:t xml:space="preserve">ETo</w:t>
+      </w:r>
+      <w:r>
+        <w:t xml:space="preserve"> </w:t>
+      </w:r>
+      <w:r>
+        <w:t xml:space="preserve">directly — row 1 above gives</w:t>
+      </w:r>
+      <w:r>
+        <w:t xml:space="preserve"> </w:t>
+      </w:r>
+      <w:r>
+        <w:rPr>
+          <w:rStyle w:val="VerbatimChar"/>
+        </w:rPr>
+        <w:t xml:space="preserve">ETo</w:t>
+      </w:r>
+      <w:r>
+        <w:t xml:space="preserve"> </w:t>
+      </w:r>
+      <w:r>
+        <w:t xml:space="preserve">= 5.32 mm/day. (An older station path, by</w:t>
+      </w:r>
+      <w:r>
+        <w:t xml:space="preserve"> </w:t>
+      </w:r>
+      <w:r>
+        <w:t xml:space="preserve">WMO/airport code, is retained but its Weather Underground source was discontinued;</w:t>
+      </w:r>
+      <w:r>
+        <w:t xml:space="preserve"> </w:t>
+      </w:r>
+      <w:r>
+        <w:t xml:space="preserve">use the coordinate/POWER path above.)</w:t>
+      </w:r>
+    </w:p>
+    <w:p>
+      <w:pPr>
+        <w:pStyle w:val="BlockText"/>
+      </w:pPr>
+      <w:r>
+        <w:rPr>
+          <w:bCs/>
+          <w:b/>
+        </w:rPr>
+        <w:t xml:space="preserve">Getting the data manually — no R needed.</w:t>
+      </w:r>
+      <w:r>
+        <w:t xml:space="preserve"> </w:t>
+      </w:r>
+      <w:r>
+        <w:t xml:space="preserve">The same series is available from the</w:t>
+      </w:r>
+      <w:r>
+        <w:t xml:space="preserve"> </w:t>
+      </w:r>
+      <w:r>
+        <w:t xml:space="preserve">web:</w:t>
+      </w:r>
+      <w:r>
+        <w:t xml:space="preserve"> </w:t>
+      </w:r>
+      <w:r>
         <w:t xml:space="preserve">-</w:t>
       </w:r>
       <w:r>
-        <w:rPr>
-          <w:rStyle w:val="FloatTok"/>
-        </w:rPr>
-        <w:t xml:space="preserve">1.5</w:t>
-      </w:r>
-      <w:r>
-        <w:rPr>
-          <w:rStyle w:val="NormalTok"/>
-        </w:rPr>
-        <w:t xml:space="preserve">, </w:t>
-      </w:r>
-      <w:r>
-        <w:rPr>
-          <w:rStyle w:val="AttributeTok"/>
-        </w:rPr>
-        <w:t xml:space="preserve">latitude =</w:t>
-      </w:r>
-      <w:r>
-        <w:rPr>
-          <w:rStyle w:val="NormalTok"/>
-        </w:rPr>
-        <w:t xml:space="preserve"> </w:t>
-      </w:r>
-      <w:r>
-        <w:rPr>
-          <w:rStyle w:val="FloatTok"/>
-        </w:rPr>
-        <w:t xml:space="preserve">6.7</w:t>
-      </w:r>
-      <w:r>
-        <w:rPr>
-          <w:rStyle w:val="NormalTok"/>
-        </w:rPr>
-        <w:t xml:space="preserve">,</w:t>
-      </w:r>
-      <w:r>
-        <w:br/>
-      </w:r>
-      <w:r>
-        <w:rPr>
-          <w:rStyle w:val="NormalTok"/>
-        </w:rPr>
-        <w:t xml:space="preserve">                  </w:t>
-      </w:r>
-      <w:r>
-        <w:rPr>
-          <w:rStyle w:val="AttributeTok"/>
-        </w:rPr>
-        <w:t xml:space="preserve">NASA.SSE =</w:t>
-      </w:r>
-      <w:r>
-        <w:rPr>
-          <w:rStyle w:val="NormalTok"/>
-        </w:rPr>
-        <w:t xml:space="preserve"> </w:t>
-      </w:r>
-      <w:r>
-        <w:rPr>
-          <w:rStyle w:val="FunctionTok"/>
-        </w:rPr>
-        <w:t xml:space="preserve">list</w:t>
-      </w:r>
-      <w:r>
-        <w:rPr>
-          <w:rStyle w:val="NormalTok"/>
-        </w:rPr>
-        <w:t xml:space="preserve">(</w:t>
-      </w:r>
-      <w:r>
-        <w:rPr>
-          <w:rStyle w:val="AttributeTok"/>
-        </w:rPr>
-        <w:t xml:space="preserve">from =</w:t>
-      </w:r>
-      <w:r>
-        <w:rPr>
-          <w:rStyle w:val="NormalTok"/>
-        </w:rPr>
-        <w:t xml:space="preserve"> </w:t>
-      </w:r>
-      <w:r>
-        <w:rPr>
-          <w:rStyle w:val="StringTok"/>
-        </w:rPr>
-        <w:t xml:space="preserve">"2001-04-01"</w:t>
-      </w:r>
-      <w:r>
-        <w:rPr>
-          <w:rStyle w:val="NormalTok"/>
-        </w:rPr>
-        <w:t xml:space="preserve">, </w:t>
-      </w:r>
-      <w:r>
-        <w:rPr>
-          <w:rStyle w:val="AttributeTok"/>
-        </w:rPr>
-        <w:t xml:space="preserve">to =</w:t>
-      </w:r>
-      <w:r>
-        <w:rPr>
-          <w:rStyle w:val="NormalTok"/>
-        </w:rPr>
-        <w:t xml:space="preserve"> </w:t>
-      </w:r>
-      <w:r>
-        <w:rPr>
-          <w:rStyle w:val="StringTok"/>
-        </w:rPr>
-        <w:t xml:space="preserve">"2002-04-01"</w:t>
-      </w:r>
-      <w:r>
-        <w:rPr>
-          <w:rStyle w:val="NormalTok"/>
-        </w:rPr>
-        <w:t xml:space="preserve">))</w:t>
-      </w:r>
-      <w:r>
-        <w:br/>
-      </w:r>
-      <w:r>
-        <w:rPr>
-          <w:rStyle w:val="NormalTok"/>
-        </w:rPr>
-        <w:t xml:space="preserve">kumasi</w:t>
-      </w:r>
-      <w:r>
-        <w:rPr>
-          <w:rStyle w:val="SpecialCharTok"/>
-        </w:rPr>
-        <w:t xml:space="preserve">$</w:t>
-      </w:r>
-      <w:r>
-        <w:rPr>
-          <w:rStyle w:val="NormalTok"/>
-        </w:rPr>
-        <w:t xml:space="preserve">NASA.SEE</w:t>
-      </w:r>
-      <w:r>
-        <w:rPr>
-          <w:rStyle w:val="SpecialCharTok"/>
-        </w:rPr>
-        <w:t xml:space="preserve">$</w:t>
-      </w:r>
-      <w:r>
-        <w:rPr>
-          <w:rStyle w:val="NormalTok"/>
-        </w:rPr>
-        <w:t xml:space="preserve">data</w:t>
-      </w:r>
-    </w:p>
-    <w:p>
-      <w:pPr>
-        <w:pStyle w:val="FirstParagraph"/>
-      </w:pPr>
-      <w:r>
-        <w:t xml:space="preserve">It returns hourly and daily WMO tables and the NASA SSE series; feed the columns to</w:t>
+        <w:t xml:space="preserve"> </w:t>
+      </w:r>
+      <w:r>
+        <w:rPr>
+          <w:bCs/>
+          <w:b/>
+        </w:rPr>
+        <w:t xml:space="preserve">NASA POWER Data Access Viewer</w:t>
+      </w:r>
+      <w:r>
+        <w:t xml:space="preserve"> </w:t>
+      </w:r>
+      <w:r>
+        <w:t xml:space="preserve">(point-and-click download):</w:t>
+      </w:r>
+      <w:r>
+        <w:t xml:space="preserve"> </w:t>
+      </w:r>
+      <w:hyperlink r:id="rId27">
+        <w:r>
+          <w:rPr>
+            <w:rStyle w:val="Hyperlink"/>
+          </w:rPr>
+          <w:t xml:space="preserve">https://power.larc.nasa.gov/data-access-viewer/</w:t>
+        </w:r>
+      </w:hyperlink>
+      <w:r>
+        <w:t xml:space="preserve"> </w:t>
+      </w:r>
+      <w:r>
+        <w:t xml:space="preserve">-</w:t>
+      </w:r>
+      <w:r>
+        <w:t xml:space="preserve"> </w:t>
+      </w:r>
+      <w:r>
+        <w:rPr>
+          <w:bCs/>
+          <w:b/>
+        </w:rPr>
+        <w:t xml:space="preserve">POWER API documentation</w:t>
+      </w:r>
+      <w:r>
+        <w:t xml:space="preserve"> </w:t>
+      </w:r>
+      <w:r>
+        <w:t xml:space="preserve">(the endpoint</w:t>
+      </w:r>
+      <w:r>
+        <w:t xml:space="preserve"> </w:t>
+      </w:r>
+      <w:r>
+        <w:rPr>
+          <w:rStyle w:val="VerbatimChar"/>
+        </w:rPr>
+        <w:t xml:space="preserve">weather()</w:t>
+      </w:r>
+      <w:r>
+        <w:t xml:space="preserve"> </w:t>
+      </w:r>
+      <w:r>
+        <w:t xml:space="preserve">calls):</w:t>
+      </w:r>
+      <w:r>
+        <w:t xml:space="preserve"> </w:t>
+      </w:r>
+      <w:hyperlink r:id="rId28">
+        <w:r>
+          <w:rPr>
+            <w:rStyle w:val="Hyperlink"/>
+          </w:rPr>
+          <w:t xml:space="preserve">https://power.larc.nasa.gov/docs/services/api/temporal/daily/</w:t>
+        </w:r>
+      </w:hyperlink>
+      <w:r>
+        <w:t xml:space="preserve"> </w:t>
+      </w:r>
+      <w:r>
+        <w:t xml:space="preserve">-</w:t>
+      </w:r>
+      <w:r>
+        <w:t xml:space="preserve"> </w:t>
+      </w:r>
+      <w:r>
+        <w:rPr>
+          <w:bCs/>
+          <w:b/>
+        </w:rPr>
+        <w:t xml:space="preserve">POWER home</w:t>
+      </w:r>
+      <w:r>
+        <w:t xml:space="preserve">:</w:t>
+      </w:r>
+      <w:r>
+        <w:t xml:space="preserve"> </w:t>
+      </w:r>
+      <w:hyperlink r:id="rId29">
+        <w:r>
+          <w:rPr>
+            <w:rStyle w:val="Hyperlink"/>
+          </w:rPr>
+          <w:t xml:space="preserve">https://power.larc.nasa.gov</w:t>
+        </w:r>
+      </w:hyperlink>
+    </w:p>
+    <w:p>
+      <w:pPr>
+        <w:pStyle w:val="BlockText"/>
+      </w:pPr>
+      <w:r>
+        <w:t xml:space="preserve">Other free weather/solar sources you can feed to</w:t>
       </w:r>
       <w:r>
         <w:t xml:space="preserve"> </w:t>
@@ -4205,17 +4722,146 @@
         <w:t xml:space="preserve">kc</w:t>
       </w:r>
       <w:r>
-        <w:t xml:space="preserve">. (This section needs a live connection and is not part of the offline</w:t>
-      </w:r>
-      <w:r>
-        <w:t xml:space="preserve"> </w:t>
-      </w:r>
-      <w:r>
-        <w:t xml:space="preserve">reproduction.)</w:t>
-      </w:r>
-    </w:p>
-    <w:bookmarkEnd w:id="27"/>
-    <w:bookmarkStart w:id="31" w:name="X5f2f208afa509718a16425317cca83caa5aa17a"/>
+        <w:t xml:space="preserve">:</w:t>
+      </w:r>
+      <w:r>
+        <w:t xml:space="preserve"> </w:t>
+      </w:r>
+      <w:r>
+        <w:t xml:space="preserve">-</w:t>
+      </w:r>
+      <w:r>
+        <w:t xml:space="preserve"> </w:t>
+      </w:r>
+      <w:r>
+        <w:rPr>
+          <w:bCs/>
+          <w:b/>
+        </w:rPr>
+        <w:t xml:space="preserve">Open-Meteo</w:t>
+      </w:r>
+      <w:r>
+        <w:t xml:space="preserve"> </w:t>
+      </w:r>
+      <w:r>
+        <w:t xml:space="preserve">— historical + forecast API, no key:</w:t>
+      </w:r>
+      <w:r>
+        <w:t xml:space="preserve"> </w:t>
+      </w:r>
+      <w:hyperlink r:id="rId30">
+        <w:r>
+          <w:rPr>
+            <w:rStyle w:val="Hyperlink"/>
+          </w:rPr>
+          <w:t xml:space="preserve">https://open-meteo.com</w:t>
+        </w:r>
+      </w:hyperlink>
+      <w:r>
+        <w:t xml:space="preserve"> </w:t>
+      </w:r>
+      <w:r>
+        <w:t xml:space="preserve">-</w:t>
+      </w:r>
+      <w:r>
+        <w:t xml:space="preserve"> </w:t>
+      </w:r>
+      <w:r>
+        <w:rPr>
+          <w:bCs/>
+          <w:b/>
+        </w:rPr>
+        <w:t xml:space="preserve">Copernicus ERA5 (CDS)</w:t>
+      </w:r>
+      <w:r>
+        <w:t xml:space="preserve">:</w:t>
+      </w:r>
+      <w:r>
+        <w:t xml:space="preserve"> </w:t>
+      </w:r>
+      <w:hyperlink r:id="rId31">
+        <w:r>
+          <w:rPr>
+            <w:rStyle w:val="Hyperlink"/>
+          </w:rPr>
+          <w:t xml:space="preserve">https://cds.climate.copernicus.eu</w:t>
+        </w:r>
+      </w:hyperlink>
+      <w:r>
+        <w:t xml:space="preserve"> </w:t>
+      </w:r>
+      <w:r>
+        <w:t xml:space="preserve">-</w:t>
+      </w:r>
+      <w:r>
+        <w:t xml:space="preserve"> </w:t>
+      </w:r>
+      <w:r>
+        <w:rPr>
+          <w:bCs/>
+          <w:b/>
+        </w:rPr>
+        <w:t xml:space="preserve">NOAA Climate Data Online (GHCN stations)</w:t>
+      </w:r>
+      <w:r>
+        <w:t xml:space="preserve">:</w:t>
+      </w:r>
+      <w:r>
+        <w:t xml:space="preserve"> </w:t>
+      </w:r>
+      <w:hyperlink r:id="rId32">
+        <w:r>
+          <w:rPr>
+            <w:rStyle w:val="Hyperlink"/>
+          </w:rPr>
+          <w:t xml:space="preserve">https://www.ncei.noaa.gov/cdo-web/</w:t>
+        </w:r>
+      </w:hyperlink>
+      <w:r>
+        <w:t xml:space="preserve"> </w:t>
+      </w:r>
+      <w:r>
+        <w:t xml:space="preserve">- a</w:t>
+      </w:r>
+      <w:r>
+        <w:t xml:space="preserve"> </w:t>
+      </w:r>
+      <w:r>
+        <w:rPr>
+          <w:bCs/>
+          <w:b/>
+        </w:rPr>
+        <w:t xml:space="preserve">local met agency</w:t>
+      </w:r>
+      <w:r>
+        <w:t xml:space="preserve"> </w:t>
+      </w:r>
+      <w:r>
+        <w:t xml:space="preserve">(e.g. the Ghana Meteorological Agency) for station records.</w:t>
+      </w:r>
+    </w:p>
+    <w:p>
+      <w:pPr>
+        <w:pStyle w:val="BlockText"/>
+      </w:pPr>
+      <w:r>
+        <w:t xml:space="preserve">POWER covers ~1981 to near-present at ~0.5° resolution; for field-scale work a</w:t>
+      </w:r>
+      <w:r>
+        <w:t xml:space="preserve"> </w:t>
+      </w:r>
+      <w:r>
+        <w:t xml:space="preserve">nearby ground station is preferable where available. This section needs a live</w:t>
+      </w:r>
+      <w:r>
+        <w:t xml:space="preserve"> </w:t>
+      </w:r>
+      <w:r>
+        <w:t xml:space="preserve">connection and is not part of the offline reproduction.</w:t>
+      </w:r>
+    </w:p>
+    <w:bookmarkEnd w:id="33"/>
+    <w:bookmarkStart w:id="37" w:name="X5f2f208afa509718a16425317cca83caa5aa17a"/>
     <w:p>
       <w:pPr>
         <w:pStyle w:val="Heading2"/>
@@ -6687,18 +7333,18 @@
           <wp:inline>
             <wp:extent cx="5334000" cy="3852333"/>
             <wp:effectExtent b="0" l="0" r="0" t="0"/>
-            <wp:docPr descr="Figure 1: Dual crop coefficient over the season. The basal Kcb (dashed) is the transpiration curve; the adjusted Kc (solid) adds soil-evaporation spikes after each wetting, and dips where water stress reduces it. Kc_adj ranges 0.42–1.21, Kcb 0.30–0.42." title="" id="29" name="Picture"/>
+            <wp:docPr descr="Figure 1: Dual crop coefficient over the season. The basal Kcb (dashed) is the transpiration curve; the adjusted Kc (solid) adds soil-evaporation spikes after each wetting, and dips where water stress reduces it. Kc_adj ranges 0.42–1.21, Kcb 0.30–0.42." title="" id="35" name="Picture"/>
             <a:graphic>
               <a:graphicData uri="http://schemas.openxmlformats.org/drawingml/2006/picture">
                 <pic:pic>
                   <pic:nvPicPr>
-                    <pic:cNvPr descr="figures/fig_kc_curve.png" id="30" name="Picture"/>
+                    <pic:cNvPr descr="figures/fig_kc_curve.png" id="36" name="Picture"/>
                     <pic:cNvPicPr>
                       <a:picLocks noChangeArrowheads="1" noChangeAspect="1"/>
                     </pic:cNvPicPr>
                   </pic:nvPicPr>
                   <pic:blipFill>
-                    <a:blip r:embed="rId28"/>
+                    <a:blip r:embed="rId34"/>
                     <a:stretch>
                       <a:fillRect/>
                     </a:stretch>
@@ -6733,8 +7379,8 @@
         <w:t xml:space="preserve">Figure 1: Dual crop coefficient over the season. The basal Kcb (dashed) is the transpiration curve; the adjusted Kc (solid) adds soil-evaporation spikes after each wetting, and dips where water stress reduces it. Kc_adj ranges 0.42–1.21, Kcb 0.30–0.42.</w:t>
       </w:r>
     </w:p>
-    <w:bookmarkEnd w:id="31"/>
-    <w:bookmarkStart w:id="32" w:name="cal.kc-calibrating-the-water-balance"/>
+    <w:bookmarkEnd w:id="37"/>
+    <w:bookmarkStart w:id="38" w:name="cal.kc-calibrating-the-water-balance"/>
     <w:p>
       <w:pPr>
         <w:pStyle w:val="Heading2"/>
@@ -6943,8 +7589,8 @@
         <w:t xml:space="preserve">but not part of the offline reproduction — the only two functions in that category.)</w:t>
       </w:r>
     </w:p>
-    <w:bookmarkEnd w:id="32"/>
-    <w:bookmarkStart w:id="33" w:name="Xa4682b73385f14f6a6f679141ac27adbec9b992"/>
+    <w:bookmarkEnd w:id="38"/>
+    <w:bookmarkStart w:id="39" w:name="Xa4682b73385f14f6a6f679141ac27adbec9b992"/>
     <w:p>
       <w:pPr>
         <w:pStyle w:val="Heading2"/>
@@ -7377,9 +8023,9 @@
         </w:pict>
       </w:r>
     </w:p>
-    <w:bookmarkEnd w:id="33"/>
-    <w:bookmarkEnd w:id="34"/>
-    <w:bookmarkStart w:id="62" w:name="part-2-et-from-satellite-imagery-spatial"/>
+    <w:bookmarkEnd w:id="39"/>
+    <w:bookmarkEnd w:id="40"/>
+    <w:bookmarkStart w:id="68" w:name="part-2-et-from-satellite-imagery-spatial"/>
     <w:p>
       <w:pPr>
         <w:pStyle w:val="Heading1"/>
@@ -7542,7 +8188,7 @@
         <w:t xml:space="preserve">is a different way of solving one equation for LE.</w:t>
       </w:r>
     </w:p>
-    <w:bookmarkStart w:id="35" w:name="Xc3980385cb159750392c8d975c0ac2e5c268c78"/>
+    <w:bookmarkStart w:id="41" w:name="Xc3980385cb159750392c8d975c0ac2e5c268c78"/>
     <w:p>
       <w:pPr>
         <w:pStyle w:val="Heading2"/>
@@ -8158,8 +8804,8 @@
         <w:t xml:space="preserve">(Sections 13–15).</w:t>
       </w:r>
     </w:p>
-    <w:bookmarkEnd w:id="35"/>
-    <w:bookmarkStart w:id="45" w:name="Xd7d79c4af8efc101a24620fe6da62799595e34f"/>
+    <w:bookmarkEnd w:id="41"/>
+    <w:bookmarkStart w:id="51" w:name="Xd7d79c4af8efc101a24620fe6da62799595e34f"/>
     <w:p>
       <w:pPr>
         <w:pStyle w:val="Heading2"/>
@@ -9002,122 +9648,12 @@
           <wp:inline>
             <wp:extent cx="5334000" cy="3852333"/>
             <wp:effectExtent b="0" l="0" r="0" t="0"/>
-            <wp:docPr descr="Figure 2: Surface albedo from the Landsat-7 scene (fraction of incoming shortwave reflected)." title="" id="37" name="Picture"/>
+            <wp:docPr descr="Figure 2: Surface albedo from the Landsat-7 scene (fraction of incoming shortwave reflected)." title="" id="43" name="Picture"/>
             <a:graphic>
               <a:graphicData uri="http://schemas.openxmlformats.org/drawingml/2006/picture">
                 <pic:pic>
                   <pic:nvPicPr>
-                    <pic:cNvPr descr="figures/fig_albedo.png" id="38" name="Picture"/>
-                    <pic:cNvPicPr>
-                      <a:picLocks noChangeArrowheads="1" noChangeAspect="1"/>
-                    </pic:cNvPicPr>
-                  </pic:nvPicPr>
-                  <pic:blipFill>
-                    <a:blip r:embed="rId36"/>
-                    <a:stretch>
-                      <a:fillRect/>
-                    </a:stretch>
-                  </pic:blipFill>
-                  <pic:spPr bwMode="auto">
-                    <a:xfrm>
-                      <a:off x="0" y="0"/>
-                      <a:ext cx="5334000" cy="3852333"/>
-                    </a:xfrm>
-                    <a:prstGeom prst="rect">
-                      <a:avLst/>
-                    </a:prstGeom>
-                    <a:noFill/>
-                    <a:ln w="9525">
-                      <a:noFill/>
-                      <a:headEnd/>
-                      <a:tailEnd/>
-                    </a:ln>
-                  </pic:spPr>
-                </pic:pic>
-              </a:graphicData>
-            </a:graphic>
-          </wp:inline>
-        </w:drawing>
-      </w:r>
-    </w:p>
-    <w:p>
-      <w:pPr>
-        <w:pStyle w:val="ImageCaption"/>
-      </w:pPr>
-      <w:r>
-        <w:t xml:space="preserve">Figure 2: Surface albedo from the Landsat-7 scene (fraction of incoming shortwave reflected).</w:t>
-      </w:r>
-    </w:p>
-    <w:p>
-      <w:pPr>
-        <w:pStyle w:val="CaptionedFigure"/>
-      </w:pPr>
-      <w:r>
-        <w:drawing>
-          <wp:inline>
-            <wp:extent cx="5334000" cy="3852333"/>
-            <wp:effectExtent b="0" l="0" r="0" t="0"/>
-            <wp:docPr descr="Figure 3: NDVI — the normalised vegetation index; higher = greener, more transpiring vegetation." title="" id="40" name="Picture"/>
-            <a:graphic>
-              <a:graphicData uri="http://schemas.openxmlformats.org/drawingml/2006/picture">
-                <pic:pic>
-                  <pic:nvPicPr>
-                    <pic:cNvPr descr="figures/fig_NDVI.png" id="41" name="Picture"/>
-                    <pic:cNvPicPr>
-                      <a:picLocks noChangeArrowheads="1" noChangeAspect="1"/>
-                    </pic:cNvPicPr>
-                  </pic:nvPicPr>
-                  <pic:blipFill>
-                    <a:blip r:embed="rId39"/>
-                    <a:stretch>
-                      <a:fillRect/>
-                    </a:stretch>
-                  </pic:blipFill>
-                  <pic:spPr bwMode="auto">
-                    <a:xfrm>
-                      <a:off x="0" y="0"/>
-                      <a:ext cx="5334000" cy="3852333"/>
-                    </a:xfrm>
-                    <a:prstGeom prst="rect">
-                      <a:avLst/>
-                    </a:prstGeom>
-                    <a:noFill/>
-                    <a:ln w="9525">
-                      <a:noFill/>
-                      <a:headEnd/>
-                      <a:tailEnd/>
-                    </a:ln>
-                  </pic:spPr>
-                </pic:pic>
-              </a:graphicData>
-            </a:graphic>
-          </wp:inline>
-        </w:drawing>
-      </w:r>
-    </w:p>
-    <w:p>
-      <w:pPr>
-        <w:pStyle w:val="ImageCaption"/>
-      </w:pPr>
-      <w:r>
-        <w:t xml:space="preserve">Figure 3: NDVI — the normalised vegetation index; higher = greener, more transpiring vegetation.</w:t>
-      </w:r>
-    </w:p>
-    <w:p>
-      <w:pPr>
-        <w:pStyle w:val="CaptionedFigure"/>
-      </w:pPr>
-      <w:r>
-        <w:drawing>
-          <wp:inline>
-            <wp:extent cx="5334000" cy="3852333"/>
-            <wp:effectExtent b="0" l="0" r="0" t="0"/>
-            <wp:docPr descr="Figure 4: Surface temperature Ts in kelvin, from the thermal band. Hot, dry surfaces evaporate little; cool surfaces are wet or vegetated." title="" id="43" name="Picture"/>
-            <a:graphic>
-              <a:graphicData uri="http://schemas.openxmlformats.org/drawingml/2006/picture">
-                <pic:pic>
-                  <pic:nvPicPr>
-                    <pic:cNvPr descr="figures/fig_Ts.png" id="44" name="Picture"/>
+                    <pic:cNvPr descr="figures/fig_albedo.png" id="44" name="Picture"/>
                     <pic:cNvPicPr>
                       <a:picLocks noChangeArrowheads="1" noChangeAspect="1"/>
                     </pic:cNvPicPr>
@@ -9155,11 +9691,121 @@
         <w:pStyle w:val="ImageCaption"/>
       </w:pPr>
       <w:r>
+        <w:t xml:space="preserve">Figure 2: Surface albedo from the Landsat-7 scene (fraction of incoming shortwave reflected).</w:t>
+      </w:r>
+    </w:p>
+    <w:p>
+      <w:pPr>
+        <w:pStyle w:val="CaptionedFigure"/>
+      </w:pPr>
+      <w:r>
+        <w:drawing>
+          <wp:inline>
+            <wp:extent cx="5334000" cy="3852333"/>
+            <wp:effectExtent b="0" l="0" r="0" t="0"/>
+            <wp:docPr descr="Figure 3: NDVI — the normalised vegetation index; higher = greener, more transpiring vegetation." title="" id="46" name="Picture"/>
+            <a:graphic>
+              <a:graphicData uri="http://schemas.openxmlformats.org/drawingml/2006/picture">
+                <pic:pic>
+                  <pic:nvPicPr>
+                    <pic:cNvPr descr="figures/fig_NDVI.png" id="47" name="Picture"/>
+                    <pic:cNvPicPr>
+                      <a:picLocks noChangeArrowheads="1" noChangeAspect="1"/>
+                    </pic:cNvPicPr>
+                  </pic:nvPicPr>
+                  <pic:blipFill>
+                    <a:blip r:embed="rId45"/>
+                    <a:stretch>
+                      <a:fillRect/>
+                    </a:stretch>
+                  </pic:blipFill>
+                  <pic:spPr bwMode="auto">
+                    <a:xfrm>
+                      <a:off x="0" y="0"/>
+                      <a:ext cx="5334000" cy="3852333"/>
+                    </a:xfrm>
+                    <a:prstGeom prst="rect">
+                      <a:avLst/>
+                    </a:prstGeom>
+                    <a:noFill/>
+                    <a:ln w="9525">
+                      <a:noFill/>
+                      <a:headEnd/>
+                      <a:tailEnd/>
+                    </a:ln>
+                  </pic:spPr>
+                </pic:pic>
+              </a:graphicData>
+            </a:graphic>
+          </wp:inline>
+        </w:drawing>
+      </w:r>
+    </w:p>
+    <w:p>
+      <w:pPr>
+        <w:pStyle w:val="ImageCaption"/>
+      </w:pPr>
+      <w:r>
+        <w:t xml:space="preserve">Figure 3: NDVI — the normalised vegetation index; higher = greener, more transpiring vegetation.</w:t>
+      </w:r>
+    </w:p>
+    <w:p>
+      <w:pPr>
+        <w:pStyle w:val="CaptionedFigure"/>
+      </w:pPr>
+      <w:r>
+        <w:drawing>
+          <wp:inline>
+            <wp:extent cx="5334000" cy="3852333"/>
+            <wp:effectExtent b="0" l="0" r="0" t="0"/>
+            <wp:docPr descr="Figure 4: Surface temperature Ts in kelvin, from the thermal band. Hot, dry surfaces evaporate little; cool surfaces are wet or vegetated." title="" id="49" name="Picture"/>
+            <a:graphic>
+              <a:graphicData uri="http://schemas.openxmlformats.org/drawingml/2006/picture">
+                <pic:pic>
+                  <pic:nvPicPr>
+                    <pic:cNvPr descr="figures/fig_Ts.png" id="50" name="Picture"/>
+                    <pic:cNvPicPr>
+                      <a:picLocks noChangeArrowheads="1" noChangeAspect="1"/>
+                    </pic:cNvPicPr>
+                  </pic:nvPicPr>
+                  <pic:blipFill>
+                    <a:blip r:embed="rId48"/>
+                    <a:stretch>
+                      <a:fillRect/>
+                    </a:stretch>
+                  </pic:blipFill>
+                  <pic:spPr bwMode="auto">
+                    <a:xfrm>
+                      <a:off x="0" y="0"/>
+                      <a:ext cx="5334000" cy="3852333"/>
+                    </a:xfrm>
+                    <a:prstGeom prst="rect">
+                      <a:avLst/>
+                    </a:prstGeom>
+                    <a:noFill/>
+                    <a:ln w="9525">
+                      <a:noFill/>
+                      <a:headEnd/>
+                      <a:tailEnd/>
+                    </a:ln>
+                  </pic:spPr>
+                </pic:pic>
+              </a:graphicData>
+            </a:graphic>
+          </wp:inline>
+        </w:drawing>
+      </w:r>
+    </w:p>
+    <w:p>
+      <w:pPr>
+        <w:pStyle w:val="ImageCaption"/>
+      </w:pPr>
+      <w:r>
         <w:t xml:space="preserve">Figure 4: Surface temperature Ts in kelvin, from the thermal band. Hot, dry surfaces evaporate little; cool surfaces are wet or vegetated.</w:t>
       </w:r>
     </w:p>
-    <w:bookmarkEnd w:id="45"/>
-    <w:bookmarkStart w:id="46" w:name="coldts-hotts-the-anchor-pixels"/>
+    <w:bookmarkEnd w:id="51"/>
+    <w:bookmarkStart w:id="52" w:name="coldts-hotts-the-anchor-pixels"/>
     <w:p>
       <w:pPr>
         <w:pStyle w:val="Heading2"/>
@@ -10403,8 +11049,8 @@
         <w:t xml:space="preserve">to run this for you.</w:t>
       </w:r>
     </w:p>
-    <w:bookmarkEnd w:id="46"/>
-    <w:bookmarkStart w:id="50" w:name="sebal-sebal-and-metric"/>
+    <w:bookmarkEnd w:id="52"/>
+    <w:bookmarkStart w:id="56" w:name="sebal-sebal-and-metric"/>
     <w:p>
       <w:pPr>
         <w:pStyle w:val="Heading2"/>
@@ -12349,18 +12995,18 @@
           <wp:inline>
             <wp:extent cx="5334000" cy="3852333"/>
             <wp:effectExtent b="0" l="0" r="0" t="0"/>
-            <wp:docPr descr="Figure 5: SEBAL evaporative fraction over Kumasi. Green (EF≈1) is wet, freely evaporating vegetation; pink/white (EF≈0) is the dry, built-up city core. Mean EF = 0.52." title="" id="48" name="Picture"/>
+            <wp:docPr descr="Figure 5: SEBAL evaporative fraction over Kumasi. Green (EF≈1) is wet, freely evaporating vegetation; pink/white (EF≈0) is the dry, built-up city core. Mean EF = 0.52." title="" id="54" name="Picture"/>
             <a:graphic>
               <a:graphicData uri="http://schemas.openxmlformats.org/drawingml/2006/picture">
                 <pic:pic>
                   <pic:nvPicPr>
-                    <pic:cNvPr descr="figures/fig_EF_SEBAL.png" id="49" name="Picture"/>
+                    <pic:cNvPr descr="figures/fig_EF_SEBAL.png" id="55" name="Picture"/>
                     <pic:cNvPicPr>
                       <a:picLocks noChangeArrowheads="1" noChangeAspect="1"/>
                     </pic:cNvPicPr>
                   </pic:nvPicPr>
                   <pic:blipFill>
-                    <a:blip r:embed="rId47"/>
+                    <a:blip r:embed="rId53"/>
                     <a:stretch>
                       <a:fillRect/>
                     </a:stretch>
@@ -12395,8 +13041,8 @@
         <w:t xml:space="preserve">Figure 5: SEBAL evaporative fraction over Kumasi. Green (EF≈1) is wet, freely evaporating vegetation; pink/white (EF≈0) is the dry, built-up city core. Mean EF = 0.52.</w:t>
       </w:r>
     </w:p>
-    <w:bookmarkEnd w:id="50"/>
-    <w:bookmarkStart w:id="54" w:name="X5eb80826482b6d5578338c8f711c995b9ce0602"/>
+    <w:bookmarkEnd w:id="56"/>
+    <w:bookmarkStart w:id="60" w:name="X5eb80826482b6d5578338c8f711c995b9ce0602"/>
     <w:p>
       <w:pPr>
         <w:pStyle w:val="Heading2"/>
@@ -13093,18 +13739,18 @@
           <wp:inline>
             <wp:extent cx="5334000" cy="3852333"/>
             <wp:effectExtent b="0" l="0" r="0" t="0"/>
-            <wp:docPr descr="Figure 6: SEBS evaporative fraction on the same scene (mean EF = 0.28). The spatial pattern matches SEBAL — wet south, dry city — but the level is lower, illustrating the between-model spread of Table 5." title="" id="52" name="Picture"/>
+            <wp:docPr descr="Figure 6: SEBS evaporative fraction on the same scene (mean EF = 0.28). The spatial pattern matches SEBAL — wet south, dry city — but the level is lower, illustrating the between-model spread of Table 5." title="" id="58" name="Picture"/>
             <a:graphic>
               <a:graphicData uri="http://schemas.openxmlformats.org/drawingml/2006/picture">
                 <pic:pic>
                   <pic:nvPicPr>
-                    <pic:cNvPr descr="figures/fig_EF_SEBS.png" id="53" name="Picture"/>
+                    <pic:cNvPr descr="figures/fig_EF_SEBS.png" id="59" name="Picture"/>
                     <pic:cNvPicPr>
                       <a:picLocks noChangeArrowheads="1" noChangeAspect="1"/>
                     </pic:cNvPicPr>
                   </pic:nvPicPr>
                   <pic:blipFill>
-                    <a:blip r:embed="rId51"/>
+                    <a:blip r:embed="rId57"/>
                     <a:stretch>
                       <a:fillRect/>
                     </a:stretch>
@@ -13455,8 +14101,8 @@
         <w:t xml:space="preserve">.</w:t>
       </w:r>
     </w:p>
-    <w:bookmarkEnd w:id="54"/>
-    <w:bookmarkStart w:id="58" w:name="tseb-the-two-source-model"/>
+    <w:bookmarkEnd w:id="60"/>
+    <w:bookmarkStart w:id="64" w:name="tseb-the-two-source-model"/>
     <w:p>
       <w:pPr>
         <w:pStyle w:val="Heading2"/>
@@ -14074,18 +14720,18 @@
           <wp:inline>
             <wp:extent cx="5334000" cy="3852333"/>
             <wp:effectExtent b="0" l="0" r="0" t="0"/>
-            <wp:docPr descr="Figure 7: TSEB (parallel) daily evapotranspiration ET24 [mm/day], partitioned internally into soil evaporation and canopy transpiration." title="" id="56" name="Picture"/>
+            <wp:docPr descr="Figure 7: TSEB (parallel) daily evapotranspiration ET24 [mm/day], partitioned internally into soil evaporation and canopy transpiration." title="" id="62" name="Picture"/>
             <a:graphic>
               <a:graphicData uri="http://schemas.openxmlformats.org/drawingml/2006/picture">
                 <pic:pic>
                   <pic:nvPicPr>
-                    <pic:cNvPr descr="figures/fig_TSEB_parallel_ET24.png" id="57" name="Picture"/>
+                    <pic:cNvPr descr="figures/fig_TSEB_parallel_ET24.png" id="63" name="Picture"/>
                     <pic:cNvPicPr>
                       <a:picLocks noChangeArrowheads="1" noChangeAspect="1"/>
                     </pic:cNvPicPr>
                   </pic:nvPicPr>
                   <pic:blipFill>
-                    <a:blip r:embed="rId55"/>
+                    <a:blip r:embed="rId61"/>
                     <a:stretch>
                       <a:fillRect/>
                     </a:stretch>
@@ -14120,8 +14766,8 @@
         <w:t xml:space="preserve">Figure 7: TSEB (parallel) daily evapotranspiration ET24 [mm/day], partitioned internally into soil evaporation and canopy transpiration.</w:t>
       </w:r>
     </w:p>
-    <w:bookmarkEnd w:id="58"/>
-    <w:bookmarkStart w:id="59" w:name="comparing-the-models"/>
+    <w:bookmarkEnd w:id="64"/>
+    <w:bookmarkStart w:id="65" w:name="comparing-the-models"/>
     <w:p>
       <w:pPr>
         <w:pStyle w:val="Heading2"/>
@@ -14480,8 +15126,8 @@
         <w:t xml:space="preserve">are scarce; SEBAL/METRIC are the reference when anchor pixels and weather are good.</w:t>
       </w:r>
     </w:p>
-    <w:bookmarkEnd w:id="59"/>
-    <w:bookmarkStart w:id="60" w:name="wdi-the-water-deficit-index"/>
+    <w:bookmarkEnd w:id="65"/>
+    <w:bookmarkStart w:id="66" w:name="wdi-the-water-deficit-index"/>
     <w:p>
       <w:pPr>
         <w:pStyle w:val="Heading2"/>
@@ -14797,8 +15443,8 @@
         <w:t xml:space="preserve">invoke the interactive anchor routine (Section 12).</w:t>
       </w:r>
     </w:p>
-    <w:bookmarkEnd w:id="60"/>
-    <w:bookmarkStart w:id="61" w:name="Xbd2a5246afabd091950f726953a9eb43d172365"/>
+    <w:bookmarkEnd w:id="66"/>
+    <w:bookmarkStart w:id="67" w:name="Xbd2a5246afabd091950f726953a9eb43d172365"/>
     <w:p>
       <w:pPr>
         <w:pStyle w:val="Heading2"/>
@@ -15549,9 +16195,9 @@
         </w:pict>
       </w:r>
     </w:p>
-    <w:bookmarkEnd w:id="61"/>
-    <w:bookmarkEnd w:id="62"/>
-    <w:bookmarkStart w:id="68" w:name="part-3-reference"/>
+    <w:bookmarkEnd w:id="67"/>
+    <w:bookmarkEnd w:id="68"/>
+    <w:bookmarkStart w:id="74" w:name="part-3-reference"/>
     <w:p>
       <w:pPr>
         <w:pStyle w:val="Heading1"/>
@@ -15560,7 +16206,7 @@
         <w:t xml:space="preserve">PART 3 — Reference</w:t>
       </w:r>
     </w:p>
-    <w:bookmarkStart w:id="63" w:name="function-and-argument-reference"/>
+    <w:bookmarkStart w:id="69" w:name="function-and-argument-reference"/>
     <w:p>
       <w:pPr>
         <w:pStyle w:val="Heading2"/>
@@ -16654,8 +17300,8 @@
         <w:t xml:space="preserve">.</w:t>
       </w:r>
     </w:p>
-    <w:bookmarkEnd w:id="63"/>
-    <w:bookmarkStart w:id="64" w:name="the-bundled-data"/>
+    <w:bookmarkEnd w:id="69"/>
+    <w:bookmarkStart w:id="70" w:name="the-bundled-data"/>
     <w:p>
       <w:pPr>
         <w:pStyle w:val="Heading2"/>
@@ -16897,8 +17543,8 @@
         <w:t xml:space="preserve">2.6/4.5/8.5 climate scenarios to 2050) for time-series and climate-change work.</w:t>
       </w:r>
     </w:p>
-    <w:bookmarkEnd w:id="64"/>
-    <w:bookmarkStart w:id="65" w:name="reproducing-the-figures"/>
+    <w:bookmarkEnd w:id="70"/>
+    <w:bookmarkStart w:id="71" w:name="reproducing-the-figures"/>
     <w:p>
       <w:pPr>
         <w:pStyle w:val="Heading2"/>
@@ -17003,8 +17649,8 @@
         <w:t xml:space="preserve">.</w:t>
       </w:r>
     </w:p>
-    <w:bookmarkEnd w:id="65"/>
-    <w:bookmarkStart w:id="66" w:name="glossary"/>
+    <w:bookmarkEnd w:id="71"/>
+    <w:bookmarkStart w:id="72" w:name="glossary"/>
     <w:p>
       <w:pPr>
         <w:pStyle w:val="Heading2"/>
@@ -17229,8 +17875,8 @@
         <w:t xml:space="preserve">— surface-energy-balance models.</w:t>
       </w:r>
     </w:p>
-    <w:bookmarkEnd w:id="66"/>
-    <w:bookmarkStart w:id="67" w:name="exercises"/>
+    <w:bookmarkEnd w:id="72"/>
+    <w:bookmarkStart w:id="73" w:name="exercises"/>
     <w:p>
       <w:pPr>
         <w:pStyle w:val="Heading2"/>
@@ -17605,9 +18251,9 @@
         </w:pict>
       </w:r>
     </w:p>
-    <w:bookmarkEnd w:id="67"/>
-    <w:bookmarkEnd w:id="68"/>
-    <w:bookmarkStart w:id="88" w:name="part-4-projects"/>
+    <w:bookmarkEnd w:id="73"/>
+    <w:bookmarkEnd w:id="74"/>
+    <w:bookmarkStart w:id="93" w:name="part-4-projects"/>
     <w:p>
       <w:pPr>
         <w:pStyle w:val="Heading1"/>
@@ -17677,7 +18323,7 @@
         <w:t xml:space="preserve">sensing. Assign one per student.</w:t>
       </w:r>
     </w:p>
-    <w:bookmarkStart w:id="79" w:name="the-project-brief-template"/>
+    <w:bookmarkStart w:id="84" w:name="the-project-brief-template"/>
     <w:p>
       <w:pPr>
         <w:pStyle w:val="Heading2"/>
@@ -18210,7 +18856,7 @@
       <w:r>
         <w:t xml:space="preserve"> </w:t>
       </w:r>
-      <w:hyperlink r:id="rId69">
+      <w:hyperlink r:id="rId75">
         <w:r>
           <w:rPr>
             <w:rStyle w:val="Hyperlink"/>
@@ -18318,7 +18964,7 @@
       <w:r>
         <w:t xml:space="preserve"> </w:t>
       </w:r>
-      <w:hyperlink r:id="rId70">
+      <w:hyperlink r:id="rId76">
         <w:r>
           <w:rPr>
             <w:rStyle w:val="Hyperlink"/>
@@ -18348,7 +18994,7 @@
       <w:r>
         <w:t xml:space="preserve"> </w:t>
       </w:r>
-      <w:hyperlink r:id="rId71">
+      <w:hyperlink r:id="rId77">
         <w:r>
           <w:rPr>
             <w:rStyle w:val="Hyperlink"/>
@@ -18378,7 +19024,7 @@
       <w:r>
         <w:t xml:space="preserve"> </w:t>
       </w:r>
-      <w:hyperlink r:id="rId72">
+      <w:hyperlink r:id="rId29">
         <w:r>
           <w:rPr>
             <w:rStyle w:val="Hyperlink"/>
@@ -18408,7 +19054,7 @@
       <w:r>
         <w:t xml:space="preserve"> </w:t>
       </w:r>
-      <w:hyperlink r:id="rId73">
+      <w:hyperlink r:id="rId78">
         <w:r>
           <w:rPr>
             <w:rStyle w:val="Hyperlink"/>
@@ -18438,7 +19084,7 @@
       <w:r>
         <w:t xml:space="preserve"> </w:t>
       </w:r>
-      <w:hyperlink r:id="rId74">
+      <w:hyperlink r:id="rId79">
         <w:r>
           <w:rPr>
             <w:rStyle w:val="Hyperlink"/>
@@ -18468,7 +19114,7 @@
       <w:r>
         <w:t xml:space="preserve"> </w:t>
       </w:r>
-      <w:hyperlink r:id="rId75">
+      <w:hyperlink r:id="rId80">
         <w:r>
           <w:rPr>
             <w:rStyle w:val="Hyperlink"/>
@@ -18485,7 +19131,7 @@
       <w:r>
         <w:t xml:space="preserve"> </w:t>
       </w:r>
-      <w:hyperlink r:id="rId76">
+      <w:hyperlink r:id="rId81">
         <w:r>
           <w:rPr>
             <w:rStyle w:val="Hyperlink"/>
@@ -18515,7 +19161,7 @@
       <w:r>
         <w:t xml:space="preserve"> </w:t>
       </w:r>
-      <w:hyperlink r:id="rId77">
+      <w:hyperlink r:id="rId82">
         <w:r>
           <w:rPr>
             <w:rStyle w:val="Hyperlink"/>
@@ -18545,7 +19191,7 @@
       <w:r>
         <w:t xml:space="preserve"> </w:t>
       </w:r>
-      <w:hyperlink r:id="rId78">
+      <w:hyperlink r:id="rId83">
         <w:r>
           <w:rPr>
             <w:rStyle w:val="Hyperlink"/>
@@ -18557,8 +19203,8 @@
         <w:t xml:space="preserve">.</w:t>
       </w:r>
     </w:p>
-    <w:bookmarkEnd w:id="79"/>
-    <w:bookmarkStart w:id="81" w:name="agriculture-and-irrigation-projects"/>
+    <w:bookmarkEnd w:id="84"/>
+    <w:bookmarkStart w:id="86" w:name="agriculture-and-irrigation-projects"/>
     <w:p>
       <w:pPr>
         <w:pStyle w:val="Heading2"/>
@@ -18625,7 +19271,7 @@
       <w:r>
         <w:t xml:space="preserve"> </w:t>
       </w:r>
-      <w:hyperlink r:id="rId80">
+      <w:hyperlink r:id="rId85">
         <w:r>
           <w:rPr>
             <w:rStyle w:val="Hyperlink"/>
@@ -19104,8 +19750,8 @@
         <w:t xml:space="preserve">crop-water-use paper.</w:t>
       </w:r>
     </w:p>
-    <w:bookmarkEnd w:id="81"/>
-    <w:bookmarkStart w:id="82" w:name="hydrology-and-water-resources-projects"/>
+    <w:bookmarkEnd w:id="86"/>
+    <w:bookmarkStart w:id="87" w:name="hydrology-and-water-resources-projects"/>
     <w:p>
       <w:pPr>
         <w:pStyle w:val="Heading2"/>
@@ -19423,8 +20069,8 @@
         <w:t xml:space="preserve">a recharge-potential map and note.</w:t>
       </w:r>
     </w:p>
-    <w:bookmarkEnd w:id="82"/>
-    <w:bookmarkStart w:id="83" w:name="remote-sensing-and-land-surface-projects"/>
+    <w:bookmarkEnd w:id="87"/>
+    <w:bookmarkStart w:id="88" w:name="remote-sensing-and-land-surface-projects"/>
     <w:p>
       <w:pPr>
         <w:pStyle w:val="Heading2"/>
@@ -19957,8 +20603,8 @@
         <w:t xml:space="preserve">paper.</w:t>
       </w:r>
     </w:p>
-    <w:bookmarkEnd w:id="83"/>
-    <w:bookmarkStart w:id="84" w:name="climate-and-environment-projects"/>
+    <w:bookmarkEnd w:id="88"/>
+    <w:bookmarkStart w:id="89" w:name="climate-and-environment-projects"/>
     <w:p>
       <w:pPr>
         <w:pStyle w:val="Heading2"/>
@@ -20333,8 +20979,8 @@
         <w:t xml:space="preserve">bulletin.</w:t>
       </w:r>
     </w:p>
-    <w:bookmarkEnd w:id="84"/>
-    <w:bookmarkStart w:id="85" w:name="methods-project"/>
+    <w:bookmarkEnd w:id="89"/>
+    <w:bookmarkStart w:id="90" w:name="methods-project"/>
     <w:p>
       <w:pPr>
         <w:pStyle w:val="Heading2"/>
@@ -20560,8 +21206,8 @@
         </w:pict>
       </w:r>
     </w:p>
-    <w:bookmarkEnd w:id="85"/>
-    <w:bookmarkStart w:id="86" w:name="how-to-cite-this-manual"/>
+    <w:bookmarkEnd w:id="90"/>
+    <w:bookmarkStart w:id="91" w:name="how-to-cite-this-manual"/>
     <w:p>
       <w:pPr>
         <w:pStyle w:val="Heading2"/>
@@ -20868,8 +21514,8 @@
         </w:pict>
       </w:r>
     </w:p>
-    <w:bookmarkEnd w:id="86"/>
-    <w:bookmarkStart w:id="87" w:name="references"/>
+    <w:bookmarkEnd w:id="91"/>
+    <w:bookmarkStart w:id="92" w:name="references"/>
     <w:p>
       <w:pPr>
         <w:pStyle w:val="Heading2"/>
@@ -21386,8 +22032,8 @@
         <w:t xml:space="preserve">Kumasi Landsat data and FAO-56 examples (R 4.6.0, sebkc 1.0-7).</w:t>
       </w:r>
     </w:p>
-    <w:bookmarkEnd w:id="87"/>
-    <w:bookmarkEnd w:id="88"/>
+    <w:bookmarkEnd w:id="92"/>
+    <w:bookmarkEnd w:id="93"/>
     <w:sectPr/>
   </w:body>
 </w:document>

</xml_diff>

<commit_message>
Manual: add worked NASA POWER weather to ETo to water-balance example (with precipitation)
</commit_message>
<xml_diff>
--- a/manual/sebkc_manual.docx
+++ b/manual/sebkc_manual.docx
@@ -4559,6 +4559,925 @@
       </w:r>
       <w:r>
         <w:t xml:space="preserve">use the coordinate/POWER path above.)</w:t>
+      </w:r>
+    </w:p>
+    <w:p>
+      <w:pPr>
+        <w:pStyle w:val="BodyText"/>
+      </w:pPr>
+      <w:r>
+        <w:rPr>
+          <w:bCs/>
+          <w:b/>
+        </w:rPr>
+        <w:t xml:space="preserve">From download to ET.</w:t>
+      </w:r>
+      <w:r>
+        <w:t xml:space="preserve"> </w:t>
+      </w:r>
+      <w:r>
+        <w:t xml:space="preserve">Because the columns are already FAO-56-ready, generating</w:t>
+      </w:r>
+      <w:r>
+        <w:t xml:space="preserve"> </w:t>
+      </w:r>
+      <w:r>
+        <w:t xml:space="preserve">reference ET for every day is one</w:t>
+      </w:r>
+      <w:r>
+        <w:t xml:space="preserve"> </w:t>
+      </w:r>
+      <w:r>
+        <w:rPr>
+          <w:rStyle w:val="VerbatimChar"/>
+        </w:rPr>
+        <w:t xml:space="preserve">sapply</w:t>
+      </w:r>
+      <w:r>
+        <w:t xml:space="preserve"> </w:t>
+      </w:r>
+      <w:r>
+        <w:t xml:space="preserve">over the rows — and the precipitation</w:t>
+      </w:r>
+      <w:r>
+        <w:t xml:space="preserve"> </w:t>
+      </w:r>
+      <w:r>
+        <w:rPr>
+          <w:rStyle w:val="VerbatimChar"/>
+        </w:rPr>
+        <w:t xml:space="preserve">P</w:t>
+      </w:r>
+      <w:r>
+        <w:t xml:space="preserve"> </w:t>
+      </w:r>
+      <w:r>
+        <w:t xml:space="preserve">that POWER returns drives the water balance too:</w:t>
+      </w:r>
+    </w:p>
+    <w:p>
+      <w:pPr>
+        <w:pStyle w:val="SourceCode"/>
+      </w:pPr>
+      <w:r>
+        <w:rPr>
+          <w:rStyle w:val="NormalTok"/>
+        </w:rPr>
+        <w:t xml:space="preserve">d</w:t>
+      </w:r>
+      <w:r>
+        <w:rPr>
+          <w:rStyle w:val="SpecialCharTok"/>
+        </w:rPr>
+        <w:t xml:space="preserve">$</w:t>
+      </w:r>
+      <w:r>
+        <w:rPr>
+          <w:rStyle w:val="NormalTok"/>
+        </w:rPr>
+        <w:t xml:space="preserve">ETo </w:t>
+      </w:r>
+      <w:r>
+        <w:rPr>
+          <w:rStyle w:val="OtherTok"/>
+        </w:rPr>
+        <w:t xml:space="preserve">&lt;-</w:t>
+      </w:r>
+      <w:r>
+        <w:rPr>
+          <w:rStyle w:val="NormalTok"/>
+        </w:rPr>
+        <w:t xml:space="preserve"> </w:t>
+      </w:r>
+      <w:r>
+        <w:rPr>
+          <w:rStyle w:val="FunctionTok"/>
+        </w:rPr>
+        <w:t xml:space="preserve">sapply</w:t>
+      </w:r>
+      <w:r>
+        <w:rPr>
+          <w:rStyle w:val="NormalTok"/>
+        </w:rPr>
+        <w:t xml:space="preserve">(</w:t>
+      </w:r>
+      <w:r>
+        <w:rPr>
+          <w:rStyle w:val="FunctionTok"/>
+        </w:rPr>
+        <w:t xml:space="preserve">seq_len</w:t>
+      </w:r>
+      <w:r>
+        <w:rPr>
+          <w:rStyle w:val="NormalTok"/>
+        </w:rPr>
+        <w:t xml:space="preserve">(</w:t>
+      </w:r>
+      <w:r>
+        <w:rPr>
+          <w:rStyle w:val="FunctionTok"/>
+        </w:rPr>
+        <w:t xml:space="preserve">nrow</w:t>
+      </w:r>
+      <w:r>
+        <w:rPr>
+          <w:rStyle w:val="NormalTok"/>
+        </w:rPr>
+        <w:t xml:space="preserve">(d)), </w:t>
+      </w:r>
+      <w:r>
+        <w:rPr>
+          <w:rStyle w:val="ControlFlowTok"/>
+        </w:rPr>
+        <w:t xml:space="preserve">function</w:t>
+      </w:r>
+      <w:r>
+        <w:rPr>
+          <w:rStyle w:val="NormalTok"/>
+        </w:rPr>
+        <w:t xml:space="preserve">(i)</w:t>
+      </w:r>
+      <w:r>
+        <w:br/>
+      </w:r>
+      <w:r>
+        <w:rPr>
+          <w:rStyle w:val="NormalTok"/>
+        </w:rPr>
+        <w:t xml:space="preserve">  </w:t>
+      </w:r>
+      <w:r>
+        <w:rPr>
+          <w:rStyle w:val="FunctionTok"/>
+        </w:rPr>
+        <w:t xml:space="preserve">ETo</w:t>
+      </w:r>
+      <w:r>
+        <w:rPr>
+          <w:rStyle w:val="NormalTok"/>
+        </w:rPr>
+        <w:t xml:space="preserve">(</w:t>
+      </w:r>
+      <w:r>
+        <w:rPr>
+          <w:rStyle w:val="AttributeTok"/>
+        </w:rPr>
+        <w:t xml:space="preserve">Tmax =</w:t>
+      </w:r>
+      <w:r>
+        <w:rPr>
+          <w:rStyle w:val="NormalTok"/>
+        </w:rPr>
+        <w:t xml:space="preserve"> d</w:t>
+      </w:r>
+      <w:r>
+        <w:rPr>
+          <w:rStyle w:val="SpecialCharTok"/>
+        </w:rPr>
+        <w:t xml:space="preserve">$</w:t>
+      </w:r>
+      <w:r>
+        <w:rPr>
+          <w:rStyle w:val="NormalTok"/>
+        </w:rPr>
+        <w:t xml:space="preserve">Tmax[i], </w:t>
+      </w:r>
+      <w:r>
+        <w:rPr>
+          <w:rStyle w:val="AttributeTok"/>
+        </w:rPr>
+        <w:t xml:space="preserve">Tmin =</w:t>
+      </w:r>
+      <w:r>
+        <w:rPr>
+          <w:rStyle w:val="NormalTok"/>
+        </w:rPr>
+        <w:t xml:space="preserve"> d</w:t>
+      </w:r>
+      <w:r>
+        <w:rPr>
+          <w:rStyle w:val="SpecialCharTok"/>
+        </w:rPr>
+        <w:t xml:space="preserve">$</w:t>
+      </w:r>
+      <w:r>
+        <w:rPr>
+          <w:rStyle w:val="NormalTok"/>
+        </w:rPr>
+        <w:t xml:space="preserve">Tmin[i], </w:t>
+      </w:r>
+      <w:r>
+        <w:rPr>
+          <w:rStyle w:val="AttributeTok"/>
+        </w:rPr>
+        <w:t xml:space="preserve">RHmax =</w:t>
+      </w:r>
+      <w:r>
+        <w:rPr>
+          <w:rStyle w:val="NormalTok"/>
+        </w:rPr>
+        <w:t xml:space="preserve"> d</w:t>
+      </w:r>
+      <w:r>
+        <w:rPr>
+          <w:rStyle w:val="SpecialCharTok"/>
+        </w:rPr>
+        <w:t xml:space="preserve">$</w:t>
+      </w:r>
+      <w:r>
+        <w:rPr>
+          <w:rStyle w:val="NormalTok"/>
+        </w:rPr>
+        <w:t xml:space="preserve">RH[i], </w:t>
+      </w:r>
+      <w:r>
+        <w:rPr>
+          <w:rStyle w:val="AttributeTok"/>
+        </w:rPr>
+        <w:t xml:space="preserve">RHmin =</w:t>
+      </w:r>
+      <w:r>
+        <w:rPr>
+          <w:rStyle w:val="NormalTok"/>
+        </w:rPr>
+        <w:t xml:space="preserve"> d</w:t>
+      </w:r>
+      <w:r>
+        <w:rPr>
+          <w:rStyle w:val="SpecialCharTok"/>
+        </w:rPr>
+        <w:t xml:space="preserve">$</w:t>
+      </w:r>
+      <w:r>
+        <w:rPr>
+          <w:rStyle w:val="NormalTok"/>
+        </w:rPr>
+        <w:t xml:space="preserve">RH[i],</w:t>
+      </w:r>
+      <w:r>
+        <w:br/>
+      </w:r>
+      <w:r>
+        <w:rPr>
+          <w:rStyle w:val="NormalTok"/>
+        </w:rPr>
+        <w:t xml:space="preserve">      </w:t>
+      </w:r>
+      <w:r>
+        <w:rPr>
+          <w:rStyle w:val="AttributeTok"/>
+        </w:rPr>
+        <w:t xml:space="preserve">uz =</w:t>
+      </w:r>
+      <w:r>
+        <w:rPr>
+          <w:rStyle w:val="NormalTok"/>
+        </w:rPr>
+        <w:t xml:space="preserve"> d</w:t>
+      </w:r>
+      <w:r>
+        <w:rPr>
+          <w:rStyle w:val="SpecialCharTok"/>
+        </w:rPr>
+        <w:t xml:space="preserve">$</w:t>
+      </w:r>
+      <w:r>
+        <w:rPr>
+          <w:rStyle w:val="NormalTok"/>
+        </w:rPr>
+        <w:t xml:space="preserve">uz[i], </w:t>
+      </w:r>
+      <w:r>
+        <w:rPr>
+          <w:rStyle w:val="AttributeTok"/>
+        </w:rPr>
+        <w:t xml:space="preserve">Rs =</w:t>
+      </w:r>
+      <w:r>
+        <w:rPr>
+          <w:rStyle w:val="NormalTok"/>
+        </w:rPr>
+        <w:t xml:space="preserve"> d</w:t>
+      </w:r>
+      <w:r>
+        <w:rPr>
+          <w:rStyle w:val="SpecialCharTok"/>
+        </w:rPr>
+        <w:t xml:space="preserve">$</w:t>
+      </w:r>
+      <w:r>
+        <w:rPr>
+          <w:rStyle w:val="NormalTok"/>
+        </w:rPr>
+        <w:t xml:space="preserve">Rs[i], </w:t>
+      </w:r>
+      <w:r>
+        <w:rPr>
+          <w:rStyle w:val="AttributeTok"/>
+        </w:rPr>
+        <w:t xml:space="preserve">altitude =</w:t>
+      </w:r>
+      <w:r>
+        <w:rPr>
+          <w:rStyle w:val="NormalTok"/>
+        </w:rPr>
+        <w:t xml:space="preserve"> d</w:t>
+      </w:r>
+      <w:r>
+        <w:rPr>
+          <w:rStyle w:val="SpecialCharTok"/>
+        </w:rPr>
+        <w:t xml:space="preserve">$</w:t>
+      </w:r>
+      <w:r>
+        <w:rPr>
+          <w:rStyle w:val="NormalTok"/>
+        </w:rPr>
+        <w:t xml:space="preserve">altitude[i],</w:t>
+      </w:r>
+      <w:r>
+        <w:br/>
+      </w:r>
+      <w:r>
+        <w:rPr>
+          <w:rStyle w:val="NormalTok"/>
+        </w:rPr>
+        <w:t xml:space="preserve">      </w:t>
+      </w:r>
+      <w:r>
+        <w:rPr>
+          <w:rStyle w:val="AttributeTok"/>
+        </w:rPr>
+        <w:t xml:space="preserve">latitude =</w:t>
+      </w:r>
+      <w:r>
+        <w:rPr>
+          <w:rStyle w:val="NormalTok"/>
+        </w:rPr>
+        <w:t xml:space="preserve"> </w:t>
+      </w:r>
+      <w:r>
+        <w:rPr>
+          <w:rStyle w:val="FloatTok"/>
+        </w:rPr>
+        <w:t xml:space="preserve">6.7</w:t>
+      </w:r>
+      <w:r>
+        <w:rPr>
+          <w:rStyle w:val="NormalTok"/>
+        </w:rPr>
+        <w:t xml:space="preserve">, </w:t>
+      </w:r>
+      <w:r>
+        <w:rPr>
+          <w:rStyle w:val="AttributeTok"/>
+        </w:rPr>
+        <w:t xml:space="preserve">DOY =</w:t>
+      </w:r>
+      <w:r>
+        <w:rPr>
+          <w:rStyle w:val="NormalTok"/>
+        </w:rPr>
+        <w:t xml:space="preserve"> d</w:t>
+      </w:r>
+      <w:r>
+        <w:rPr>
+          <w:rStyle w:val="SpecialCharTok"/>
+        </w:rPr>
+        <w:t xml:space="preserve">$</w:t>
+      </w:r>
+      <w:r>
+        <w:rPr>
+          <w:rStyle w:val="NormalTok"/>
+        </w:rPr>
+        <w:t xml:space="preserve">date[i])</w:t>
+      </w:r>
+      <w:r>
+        <w:rPr>
+          <w:rStyle w:val="SpecialCharTok"/>
+        </w:rPr>
+        <w:t xml:space="preserve">$</w:t>
+      </w:r>
+      <w:r>
+        <w:rPr>
+          <w:rStyle w:val="NormalTok"/>
+        </w:rPr>
+        <w:t xml:space="preserve">ETo)</w:t>
+      </w:r>
+      <w:r>
+        <w:br/>
+      </w:r>
+      <w:r>
+        <w:rPr>
+          <w:rStyle w:val="FunctionTok"/>
+        </w:rPr>
+        <w:t xml:space="preserve">round</w:t>
+      </w:r>
+      <w:r>
+        <w:rPr>
+          <w:rStyle w:val="NormalTok"/>
+        </w:rPr>
+        <w:t xml:space="preserve">(d[, </w:t>
+      </w:r>
+      <w:r>
+        <w:rPr>
+          <w:rStyle w:val="FunctionTok"/>
+        </w:rPr>
+        <w:t xml:space="preserve">c</w:t>
+      </w:r>
+      <w:r>
+        <w:rPr>
+          <w:rStyle w:val="NormalTok"/>
+        </w:rPr>
+        <w:t xml:space="preserve">(</w:t>
+      </w:r>
+      <w:r>
+        <w:rPr>
+          <w:rStyle w:val="StringTok"/>
+        </w:rPr>
+        <w:t xml:space="preserve">"date"</w:t>
+      </w:r>
+      <w:r>
+        <w:rPr>
+          <w:rStyle w:val="NormalTok"/>
+        </w:rPr>
+        <w:t xml:space="preserve">,</w:t>
+      </w:r>
+      <w:r>
+        <w:rPr>
+          <w:rStyle w:val="StringTok"/>
+        </w:rPr>
+        <w:t xml:space="preserve">"Tmax"</w:t>
+      </w:r>
+      <w:r>
+        <w:rPr>
+          <w:rStyle w:val="NormalTok"/>
+        </w:rPr>
+        <w:t xml:space="preserve">,</w:t>
+      </w:r>
+      <w:r>
+        <w:rPr>
+          <w:rStyle w:val="StringTok"/>
+        </w:rPr>
+        <w:t xml:space="preserve">"Tmin"</w:t>
+      </w:r>
+      <w:r>
+        <w:rPr>
+          <w:rStyle w:val="NormalTok"/>
+        </w:rPr>
+        <w:t xml:space="preserve">,</w:t>
+      </w:r>
+      <w:r>
+        <w:rPr>
+          <w:rStyle w:val="StringTok"/>
+        </w:rPr>
+        <w:t xml:space="preserve">"Rs"</w:t>
+      </w:r>
+      <w:r>
+        <w:rPr>
+          <w:rStyle w:val="NormalTok"/>
+        </w:rPr>
+        <w:t xml:space="preserve">,</w:t>
+      </w:r>
+      <w:r>
+        <w:rPr>
+          <w:rStyle w:val="StringTok"/>
+        </w:rPr>
+        <w:t xml:space="preserve">"P"</w:t>
+      </w:r>
+      <w:r>
+        <w:rPr>
+          <w:rStyle w:val="NormalTok"/>
+        </w:rPr>
+        <w:t xml:space="preserve">,</w:t>
+      </w:r>
+      <w:r>
+        <w:rPr>
+          <w:rStyle w:val="StringTok"/>
+        </w:rPr>
+        <w:t xml:space="preserve">"ETo"</w:t>
+      </w:r>
+      <w:r>
+        <w:rPr>
+          <w:rStyle w:val="NormalTok"/>
+        </w:rPr>
+        <w:t xml:space="preserve">)], </w:t>
+      </w:r>
+      <w:r>
+        <w:rPr>
+          <w:rStyle w:val="DecValTok"/>
+        </w:rPr>
+        <w:t xml:space="preserve">2</w:t>
+      </w:r>
+      <w:r>
+        <w:rPr>
+          <w:rStyle w:val="NormalTok"/>
+        </w:rPr>
+        <w:t xml:space="preserve">)</w:t>
+      </w:r>
+      <w:r>
+        <w:br/>
+      </w:r>
+      <w:r>
+        <w:rPr>
+          <w:rStyle w:val="CommentTok"/>
+        </w:rPr>
+        <w:t xml:space="preserve">#&gt;         date  Tmax  Tmin    Rs    P  ETo</w:t>
+      </w:r>
+      <w:r>
+        <w:br/>
+      </w:r>
+      <w:r>
+        <w:rPr>
+          <w:rStyle w:val="CommentTok"/>
+        </w:rPr>
+        <w:t xml:space="preserve">#&gt; 1 2001-04-01 34.01 23.84 22.41 6.73 5.32</w:t>
+      </w:r>
+      <w:r>
+        <w:br/>
+      </w:r>
+      <w:r>
+        <w:rPr>
+          <w:rStyle w:val="CommentTok"/>
+        </w:rPr>
+        <w:t xml:space="preserve">#&gt; 2 2001-04-02 33.33 23.39 22.63 5.28 5.21</w:t>
+      </w:r>
+      <w:r>
+        <w:br/>
+      </w:r>
+      <w:r>
+        <w:rPr>
+          <w:rStyle w:val="CommentTok"/>
+        </w:rPr>
+        <w:t xml:space="preserve">#&gt; 3 2001-04-03 30.30 23.47 10.49 4.27 3.04   # cloudy day: low Rs -&gt; low ETo</w:t>
+      </w:r>
+      <w:r>
+        <w:br/>
+      </w:r>
+      <w:r>
+        <w:rPr>
+          <w:rStyle w:val="CommentTok"/>
+        </w:rPr>
+        <w:t xml:space="preserve">#&gt; ...                                        # 10 days: mean ETo 4.59, total rain 30.3 mm</w:t>
+      </w:r>
+      <w:r>
+        <w:br/>
+      </w:r>
+      <w:r>
+        <w:br/>
+      </w:r>
+      <w:r>
+        <w:rPr>
+          <w:rStyle w:val="CommentTok"/>
+        </w:rPr>
+        <w:t xml:space="preserve"># feed the same POWER ETo and precipitation into the FAO-56 water balance</w:t>
+      </w:r>
+      <w:r>
+        <w:br/>
+      </w:r>
+      <w:r>
+        <w:rPr>
+          <w:rStyle w:val="NormalTok"/>
+        </w:rPr>
+        <w:t xml:space="preserve">m </w:t>
+      </w:r>
+      <w:r>
+        <w:rPr>
+          <w:rStyle w:val="OtherTok"/>
+        </w:rPr>
+        <w:t xml:space="preserve">&lt;-</w:t>
+      </w:r>
+      <w:r>
+        <w:rPr>
+          <w:rStyle w:val="NormalTok"/>
+        </w:rPr>
+        <w:t xml:space="preserve"> </w:t>
+      </w:r>
+      <w:r>
+        <w:rPr>
+          <w:rStyle w:val="FunctionTok"/>
+        </w:rPr>
+        <w:t xml:space="preserve">kc</w:t>
+      </w:r>
+      <w:r>
+        <w:rPr>
+          <w:rStyle w:val="NormalTok"/>
+        </w:rPr>
+        <w:t xml:space="preserve">(</w:t>
+      </w:r>
+      <w:r>
+        <w:rPr>
+          <w:rStyle w:val="AttributeTok"/>
+        </w:rPr>
+        <w:t xml:space="preserve">ETo =</w:t>
+      </w:r>
+      <w:r>
+        <w:rPr>
+          <w:rStyle w:val="NormalTok"/>
+        </w:rPr>
+        <w:t xml:space="preserve"> d</w:t>
+      </w:r>
+      <w:r>
+        <w:rPr>
+          <w:rStyle w:val="SpecialCharTok"/>
+        </w:rPr>
+        <w:t xml:space="preserve">$</w:t>
+      </w:r>
+      <w:r>
+        <w:rPr>
+          <w:rStyle w:val="NormalTok"/>
+        </w:rPr>
+        <w:t xml:space="preserve">ETo, </w:t>
+      </w:r>
+      <w:r>
+        <w:rPr>
+          <w:rStyle w:val="AttributeTok"/>
+        </w:rPr>
+        <w:t xml:space="preserve">P =</w:t>
+      </w:r>
+      <w:r>
+        <w:rPr>
+          <w:rStyle w:val="NormalTok"/>
+        </w:rPr>
+        <w:t xml:space="preserve"> d</w:t>
+      </w:r>
+      <w:r>
+        <w:rPr>
+          <w:rStyle w:val="SpecialCharTok"/>
+        </w:rPr>
+        <w:t xml:space="preserve">$</w:t>
+      </w:r>
+      <w:r>
+        <w:rPr>
+          <w:rStyle w:val="NormalTok"/>
+        </w:rPr>
+        <w:t xml:space="preserve">P, </w:t>
+      </w:r>
+      <w:r>
+        <w:rPr>
+          <w:rStyle w:val="AttributeTok"/>
+        </w:rPr>
+        <w:t xml:space="preserve">RHmin =</w:t>
+      </w:r>
+      <w:r>
+        <w:rPr>
+          <w:rStyle w:val="NormalTok"/>
+        </w:rPr>
+        <w:t xml:space="preserve"> </w:t>
+      </w:r>
+      <w:r>
+        <w:rPr>
+          <w:rStyle w:val="DecValTok"/>
+        </w:rPr>
+        <w:t xml:space="preserve">55</w:t>
+      </w:r>
+      <w:r>
+        <w:rPr>
+          <w:rStyle w:val="NormalTok"/>
+        </w:rPr>
+        <w:t xml:space="preserve">, </w:t>
+      </w:r>
+      <w:r>
+        <w:rPr>
+          <w:rStyle w:val="AttributeTok"/>
+        </w:rPr>
+        <w:t xml:space="preserve">soil =</w:t>
+      </w:r>
+      <w:r>
+        <w:rPr>
+          <w:rStyle w:val="NormalTok"/>
+        </w:rPr>
+        <w:t xml:space="preserve"> </w:t>
+      </w:r>
+      <w:r>
+        <w:rPr>
+          <w:rStyle w:val="StringTok"/>
+        </w:rPr>
+        <w:t xml:space="preserve">"sandy loam"</w:t>
+      </w:r>
+      <w:r>
+        <w:rPr>
+          <w:rStyle w:val="NormalTok"/>
+        </w:rPr>
+        <w:t xml:space="preserve">, </w:t>
+      </w:r>
+      <w:r>
+        <w:rPr>
+          <w:rStyle w:val="AttributeTok"/>
+        </w:rPr>
+        <w:t xml:space="preserve">crop =</w:t>
+      </w:r>
+      <w:r>
+        <w:rPr>
+          <w:rStyle w:val="NormalTok"/>
+        </w:rPr>
+        <w:t xml:space="preserve"> </w:t>
+      </w:r>
+      <w:r>
+        <w:rPr>
+          <w:rStyle w:val="StringTok"/>
+        </w:rPr>
+        <w:t xml:space="preserve">"Broccoli"</w:t>
+      </w:r>
+      <w:r>
+        <w:rPr>
+          <w:rStyle w:val="NormalTok"/>
+        </w:rPr>
+        <w:t xml:space="preserve">, </w:t>
+      </w:r>
+      <w:r>
+        <w:rPr>
+          <w:rStyle w:val="AttributeTok"/>
+        </w:rPr>
+        <w:t xml:space="preserve">I =</w:t>
+      </w:r>
+      <w:r>
+        <w:rPr>
+          <w:rStyle w:val="NormalTok"/>
+        </w:rPr>
+        <w:t xml:space="preserve"> </w:t>
+      </w:r>
+      <w:r>
+        <w:rPr>
+          <w:rStyle w:val="DecValTok"/>
+        </w:rPr>
+        <w:t xml:space="preserve">0</w:t>
+      </w:r>
+      <w:r>
+        <w:rPr>
+          <w:rStyle w:val="NormalTok"/>
+        </w:rPr>
+        <w:t xml:space="preserve">)</w:t>
+      </w:r>
+      <w:r>
+        <w:br/>
+      </w:r>
+      <w:r>
+        <w:rPr>
+          <w:rStyle w:val="FunctionTok"/>
+        </w:rPr>
+        <w:t xml:space="preserve">round</w:t>
+      </w:r>
+      <w:r>
+        <w:rPr>
+          <w:rStyle w:val="NormalTok"/>
+        </w:rPr>
+        <w:t xml:space="preserve">(m</w:t>
+      </w:r>
+      <w:r>
+        <w:rPr>
+          <w:rStyle w:val="SpecialCharTok"/>
+        </w:rPr>
+        <w:t xml:space="preserve">$</w:t>
+      </w:r>
+      <w:r>
+        <w:rPr>
+          <w:rStyle w:val="NormalTok"/>
+        </w:rPr>
+        <w:t xml:space="preserve">output[, </w:t>
+      </w:r>
+      <w:r>
+        <w:rPr>
+          <w:rStyle w:val="FunctionTok"/>
+        </w:rPr>
+        <w:t xml:space="preserve">c</w:t>
+      </w:r>
+      <w:r>
+        <w:rPr>
+          <w:rStyle w:val="NormalTok"/>
+        </w:rPr>
+        <w:t xml:space="preserve">(</w:t>
+      </w:r>
+      <w:r>
+        <w:rPr>
+          <w:rStyle w:val="StringTok"/>
+        </w:rPr>
+        <w:t xml:space="preserve">"Day"</w:t>
+      </w:r>
+      <w:r>
+        <w:rPr>
+          <w:rStyle w:val="NormalTok"/>
+        </w:rPr>
+        <w:t xml:space="preserve">,</w:t>
+      </w:r>
+      <w:r>
+        <w:rPr>
+          <w:rStyle w:val="StringTok"/>
+        </w:rPr>
+        <w:t xml:space="preserve">"ETo"</w:t>
+      </w:r>
+      <w:r>
+        <w:rPr>
+          <w:rStyle w:val="NormalTok"/>
+        </w:rPr>
+        <w:t xml:space="preserve">,</w:t>
+      </w:r>
+      <w:r>
+        <w:rPr>
+          <w:rStyle w:val="StringTok"/>
+        </w:rPr>
+        <w:t xml:space="preserve">"ETc"</w:t>
+      </w:r>
+      <w:r>
+        <w:rPr>
+          <w:rStyle w:val="NormalTok"/>
+        </w:rPr>
+        <w:t xml:space="preserve">,</w:t>
+      </w:r>
+      <w:r>
+        <w:rPr>
+          <w:rStyle w:val="StringTok"/>
+        </w:rPr>
+        <w:t xml:space="preserve">"P"</w:t>
+      </w:r>
+      <w:r>
+        <w:rPr>
+          <w:rStyle w:val="NormalTok"/>
+        </w:rPr>
+        <w:t xml:space="preserve">,</w:t>
+      </w:r>
+      <w:r>
+        <w:rPr>
+          <w:rStyle w:val="StringTok"/>
+        </w:rPr>
+        <w:t xml:space="preserve">"Drend"</w:t>
+      </w:r>
+      <w:r>
+        <w:rPr>
+          <w:rStyle w:val="NormalTok"/>
+        </w:rPr>
+        <w:t xml:space="preserve">)], </w:t>
+      </w:r>
+      <w:r>
+        <w:rPr>
+          <w:rStyle w:val="DecValTok"/>
+        </w:rPr>
+        <w:t xml:space="preserve">2</w:t>
+      </w:r>
+      <w:r>
+        <w:rPr>
+          <w:rStyle w:val="NormalTok"/>
+        </w:rPr>
+        <w:t xml:space="preserve">)</w:t>
+      </w:r>
+      <w:r>
+        <w:br/>
+      </w:r>
+      <w:r>
+        <w:rPr>
+          <w:rStyle w:val="CommentTok"/>
+        </w:rPr>
+        <w:t xml:space="preserve">#&gt;    Day  ETo  ETc    P Drend</w:t>
+      </w:r>
+      <w:r>
+        <w:br/>
+      </w:r>
+      <w:r>
+        <w:rPr>
+          <w:rStyle w:val="CommentTok"/>
+        </w:rPr>
+        <w:t xml:space="preserve">#&gt; 1    1 5.32 4.70 6.73  0.67</w:t>
+      </w:r>
+      <w:r>
+        <w:br/>
+      </w:r>
+      <w:r>
+        <w:rPr>
+          <w:rStyle w:val="CommentTok"/>
+        </w:rPr>
+        <w:t xml:space="preserve">#&gt; ...</w:t>
+      </w:r>
+      <w:r>
+        <w:br/>
+      </w:r>
+      <w:r>
+        <w:rPr>
+          <w:rStyle w:val="CommentTok"/>
+        </w:rPr>
+        <w:t xml:space="preserve">#&gt; 10   10 4.50 1.74 1.03  8.32   # ~8 mm cumulative irrigation need after 10 rain-fed days</w:t>
+      </w:r>
+    </w:p>
+    <w:p>
+      <w:pPr>
+        <w:pStyle w:val="FirstParagraph"/>
+      </w:pPr>
+      <w:r>
+        <w:t xml:space="preserve">A few lines take you from a coordinate to a daily ET series and an irrigation-need</w:t>
+      </w:r>
+      <w:r>
+        <w:t xml:space="preserve"> </w:t>
+      </w:r>
+      <w:r>
+        <w:t xml:space="preserve">estimate (</w:t>
+      </w:r>
+      <w:r>
+        <w:rPr>
+          <w:rStyle w:val="VerbatimChar"/>
+        </w:rPr>
+        <w:t xml:space="preserve">Drend</w:t>
+      </w:r>
+      <w:r>
+        <w:t xml:space="preserve">), entirely from real, downloaded weather — precipitation included.</w:t>
       </w:r>
     </w:p>
     <w:p>

</xml_diff>

<commit_message>
Add plain-language crop-water-needs guide; refresh Kumasi data to present
New practical companion manual, How Much Water Does My Crop Need, for farms
near Kumasi: it states the problem and walks through crop water and irrigation
requirements for maize, tomato, cabbage, onion and pepper across the dry and
main seasons. Point-based, no satellite data, equations kept in skippable
boxes. Every number and figure is produced by reproduce_water_needs.R.

Refresh the bundled Kumasi weather record to the present. POWER weather from
2016 to 2026-07-20 is appended to the 1960-2015 station series and saved as
kumasi1960_present.rds. Rs is converted to sunshine hours n with the inverse
Angstrom-Prescott relation so the 8-column schema stays homogeneous and ETo
and kc consume it unchanged. New dataset doc kumasi1960_present.

Retitle the technical manual to Evapotranspiration from Weather and Satellites
and cross-link the two guides. README lists both. Version bumped to 1.0-8.
</commit_message>
<xml_diff>
--- a/manual/sebkc_manual.docx
+++ b/manual/sebkc_manual.docx
@@ -2,13 +2,13 @@
 <file path=word/document.xml><?xml version="1.0" encoding="utf-8"?>
 <w:document xmlns:w="http://schemas.openxmlformats.org/wordprocessingml/2006/main" xmlns:m="http://schemas.openxmlformats.org/officeDocument/2006/math" xmlns:r="http://schemas.openxmlformats.org/officeDocument/2006/relationships" xmlns:o="urn:schemas-microsoft-com:office:office" xmlns:v="urn:schemas-microsoft-com:vml" xmlns:w10="urn:schemas-microsoft-com:office:word" xmlns:a="http://schemas.openxmlformats.org/drawingml/2006/main" xmlns:pic="http://schemas.openxmlformats.org/drawingml/2006/picture" xmlns:wp="http://schemas.openxmlformats.org/drawingml/2006/wordprocessingDrawing">
   <w:body>
-    <w:bookmarkStart w:id="21" w:name="sebkc"/>
+    <w:bookmarkStart w:id="21" w:name="X9bbbe482557c36cc2332f5aaecf6624b13c4b95"/>
     <w:p>
       <w:pPr>
         <w:pStyle w:val="Heading1"/>
       </w:pPr>
       <w:r>
-        <w:t xml:space="preserve">sebkc</w:t>
+        <w:t xml:space="preserve">Evapotranspiration from Weather and Satellites</w:t>
       </w:r>
     </w:p>
     <w:p>
@@ -20,7 +20,36 @@
           <w:bCs/>
           <w:b/>
         </w:rPr>
-        <w:t xml:space="preserve">A manual to surface energy balance and crop-coefficient evapotranspiration in R</w:t>
+        <w:t xml:space="preserve">A complete guide to surface energy balance and crop-coefficient evapotranspiration in R with the</w:t>
+      </w:r>
+      <w:r>
+        <w:rPr>
+          <w:bCs/>
+          <w:b/>
+        </w:rPr>
+        <w:t xml:space="preserve"> </w:t>
+      </w:r>
+      <w:r>
+        <w:rPr>
+          <w:rStyle w:val="VerbatimChar"/>
+          <w:bCs/>
+          <w:b/>
+        </w:rPr>
+        <w:t xml:space="preserve">sebkc</w:t>
+      </w:r>
+      <w:r>
+        <w:rPr>
+          <w:bCs/>
+          <w:b/>
+        </w:rPr>
+        <w:t xml:space="preserve"> </w:t>
+      </w:r>
+      <w:r>
+        <w:rPr>
+          <w:bCs/>
+          <w:b/>
+        </w:rPr>
+        <w:t xml:space="preserve">package</w:t>
       </w:r>
     </w:p>
     <w:p>
@@ -192,7 +221,123 @@
     </w:p>
     <w:p>
       <w:pPr>
-        <w:pStyle w:val="BodyText"/>
+        <w:pStyle w:val="BlockText"/>
+      </w:pPr>
+      <w:r>
+        <w:rPr>
+          <w:bCs/>
+          <w:b/>
+        </w:rPr>
+        <w:t xml:space="preserve">New — a plain-language companion.</w:t>
+      </w:r>
+      <w:r>
+        <w:t xml:space="preserve"> </w:t>
+      </w:r>
+      <w:r>
+        <w:t xml:space="preserve">If your goal is simply</w:t>
+      </w:r>
+      <w:r>
+        <w:t xml:space="preserve"> </w:t>
+      </w:r>
+      <w:r>
+        <w:rPr>
+          <w:iCs/>
+          <w:i/>
+        </w:rPr>
+        <w:t xml:space="preserve">“</w:t>
+      </w:r>
+      <w:r>
+        <w:rPr>
+          <w:iCs/>
+          <w:i/>
+        </w:rPr>
+        <w:t xml:space="preserve">how much water</w:t>
+      </w:r>
+      <w:r>
+        <w:rPr>
+          <w:iCs/>
+          <w:i/>
+        </w:rPr>
+        <w:t xml:space="preserve"> </w:t>
+      </w:r>
+      <w:r>
+        <w:rPr>
+          <w:iCs/>
+          <w:i/>
+        </w:rPr>
+        <w:t xml:space="preserve">does my crop need and how much must I irrigate?</w:t>
+      </w:r>
+      <w:r>
+        <w:rPr>
+          <w:iCs/>
+          <w:i/>
+        </w:rPr>
+        <w:t xml:space="preserve">”</w:t>
+      </w:r>
+      <w:r>
+        <w:t xml:space="preserve">, start with the practical</w:t>
+      </w:r>
+      <w:r>
+        <w:t xml:space="preserve"> </w:t>
+      </w:r>
+      <w:r>
+        <w:t xml:space="preserve">companion guide,</w:t>
+      </w:r>
+      <w:r>
+        <w:t xml:space="preserve"> </w:t>
+      </w:r>
+      <w:r>
+        <w:rPr>
+          <w:bCs/>
+          <w:b/>
+        </w:rPr>
+        <w:t xml:space="preserve">“</w:t>
+      </w:r>
+      <w:r>
+        <w:rPr>
+          <w:bCs/>
+          <w:b/>
+        </w:rPr>
+        <w:t xml:space="preserve">How Much Water Does My Crop Need?</w:t>
+      </w:r>
+      <w:r>
+        <w:rPr>
+          <w:bCs/>
+          <w:b/>
+        </w:rPr>
+        <w:t xml:space="preserve">”</w:t>
+      </w:r>
+      <w:r>
+        <w:t xml:space="preserve"> </w:t>
+      </w:r>
+      <w:r>
+        <w:t xml:space="preserve">(</w:t>
+      </w:r>
+      <w:r>
+        <w:rPr>
+          <w:rStyle w:val="VerbatimChar"/>
+        </w:rPr>
+        <w:t xml:space="preserve">manual/crop_water_needs.md</w:t>
+      </w:r>
+      <w:r>
+        <w:t xml:space="preserve">),</w:t>
+      </w:r>
+      <w:r>
+        <w:t xml:space="preserve"> </w:t>
+      </w:r>
+      <w:r>
+        <w:t xml:space="preserve">which walks through real crop-water-needs assessments for farms near Kumasi with</w:t>
+      </w:r>
+      <w:r>
+        <w:t xml:space="preserve"> </w:t>
+      </w:r>
+      <w:r>
+        <w:t xml:space="preserve">no jargon. This manual is the full technical reference behind it.</w:t>
+      </w:r>
+    </w:p>
+    <w:p>
+      <w:pPr>
+        <w:pStyle w:val="FirstParagraph"/>
       </w:pPr>
       <w:r>
         <w:t xml:space="preserve">Dr George Owusu</w:t>

</xml_diff>